<commit_message>
Cache navigateur (.htaccess) et ajout d'Ektare aux CV
- .htaccess : HTTPS forcé ; pages, scripts, styles et CV revalidés à chaque
  visite (no-cache) ; images et polices en cache 30 jours.
- CV FR et EN : nouvelle expérience Ektare Immo (06/2023 – 12/2023).

Co-Authored-By: Claude Opus 5.5 <noreply@anthropic.com>
Claude-Session: https://claude.ai/code/session_01AXVNFt21u7UcfptizFrBPr
</commit_message>
<xml_diff>
--- a/resources/docs/biahprofile.docx
+++ b/resources/docs/biahprofile.docx
@@ -2,7 +2,7 @@
 <file path=word/document.xml><?xml version="1.0" encoding="utf-8"?>
 <w:document xmlns:w="http://schemas.openxmlformats.org/wordprocessingml/2006/main" xmlns:m="http://schemas.openxmlformats.org/officeDocument/2006/math" xmlns:r="http://schemas.openxmlformats.org/officeDocument/2006/relationships" xmlns:o="urn:schemas-microsoft-com:office:office" xmlns:v="urn:schemas-microsoft-com:vml" xmlns:w10="urn:schemas-microsoft-com:office:word" xmlns:a="http://schemas.openxmlformats.org/drawingml/2006/main" xmlns:pic="http://schemas.openxmlformats.org/drawingml/2006/picture" xmlns:wp="http://schemas.openxmlformats.org/drawingml/2006/wordprocessingDrawing">
   <w:body>
-    <w:bookmarkStart w:id="44" w:name="jean-luc-biah"/>
+    <w:bookmarkStart w:id="45" w:name="jean-luc-biah"/>
     <w:p>
       <w:pPr>
         <w:pStyle w:val="Heading1"/>
@@ -907,7 +907,7 @@
       </w:tr>
     </w:tbl>
     <w:bookmarkEnd w:id="31"/>
-    <w:bookmarkStart w:id="42" w:name="expériences"/>
+    <w:bookmarkStart w:id="43" w:name="expériences"/>
     <w:p>
       <w:pPr>
         <w:pStyle w:val="Heading2"/>
@@ -1120,7 +1120,114 @@
       </w:r>
     </w:p>
     <w:bookmarkEnd w:id="33"/>
-    <w:bookmarkStart w:id="34" w:name="X5a9ef16e59be0ea9289efff74cbad45d36d77bb"/>
+    <w:bookmarkStart w:id="34" w:name="Xc8a9c315e407c63ad25ef2aa395774123bc5098"/>
+    <w:p>
+      <w:pPr>
+        <w:pStyle w:val="Heading3"/>
+      </w:pPr>
+      <w:r>
+        <w:t xml:space="preserve">Ektare Immo, Nairobi (Kenya) — Chef de projet (projet mené en parallèle)</w:t>
+      </w:r>
+    </w:p>
+    <w:p>
+      <w:pPr>
+        <w:pStyle w:val="FirstParagraph"/>
+      </w:pPr>
+      <w:r>
+        <w:rPr>
+          <w:bCs/>
+          <w:b/>
+        </w:rPr>
+        <w:t xml:space="preserve">06/2023 – 12/2023</w:t>
+      </w:r>
+    </w:p>
+    <w:p>
+      <w:pPr>
+        <w:pStyle w:val="BodyText"/>
+      </w:pPr>
+      <w:r>
+        <w:t xml:space="preserve">Conception et réalisation d’une application de gestion immobilière pour la diaspora kényane, avec une équipe de 6.</w:t>
+      </w:r>
+    </w:p>
+    <w:p>
+      <w:pPr>
+        <w:numPr>
+          <w:ilvl w:val="0"/>
+          <w:numId w:val="1004"/>
+        </w:numPr>
+        <w:pStyle w:val="Compact"/>
+      </w:pPr>
+      <w:r>
+        <w:t xml:space="preserve">Modélisation de la solution (front, middle, back) et implémentation du middle et du back.</w:t>
+      </w:r>
+    </w:p>
+    <w:p>
+      <w:pPr>
+        <w:numPr>
+          <w:ilvl w:val="0"/>
+          <w:numId w:val="1004"/>
+        </w:numPr>
+        <w:pStyle w:val="Compact"/>
+      </w:pPr>
+      <w:r>
+        <w:t xml:space="preserve">Base MongoDB et API REST (OpenAPI, architecture Controller / Service / Repository).</w:t>
+      </w:r>
+    </w:p>
+    <w:p>
+      <w:pPr>
+        <w:numPr>
+          <w:ilvl w:val="0"/>
+          <w:numId w:val="1004"/>
+        </w:numPr>
+        <w:pStyle w:val="Compact"/>
+      </w:pPr>
+      <w:r>
+        <w:t xml:space="preserve">Application React pour le middle-office, site vitrine</w:t>
+      </w:r>
+      <w:r>
+        <w:t xml:space="preserve"> </w:t>
+      </w:r>
+      <w:hyperlink r:id="rId29">
+        <w:r>
+          <w:rPr>
+            <w:rStyle w:val="Hyperlink"/>
+          </w:rPr>
+          <w:t xml:space="preserve">hektare-immo.com</w:t>
+        </w:r>
+      </w:hyperlink>
+      <w:r>
+        <w:t xml:space="preserve"> </w:t>
+      </w:r>
+      <w:r>
+        <w:t xml:space="preserve">(HTML5, CSS3, jQuery).</w:t>
+      </w:r>
+    </w:p>
+    <w:p>
+      <w:pPr>
+        <w:numPr>
+          <w:ilvl w:val="0"/>
+          <w:numId w:val="1004"/>
+        </w:numPr>
+        <w:pStyle w:val="Compact"/>
+      </w:pPr>
+      <w:r>
+        <w:t xml:space="preserve">Pilotage Scrum / Kanban de l’équipe.</w:t>
+      </w:r>
+    </w:p>
+    <w:p>
+      <w:pPr>
+        <w:pStyle w:val="FirstParagraph"/>
+      </w:pPr>
+      <w:r>
+        <w:rPr>
+          <w:iCs/>
+          <w:i/>
+        </w:rPr>
+        <w:t xml:space="preserve">Stack : React, Node.js, Express, MongoDB, API REST, Git, GitHub</w:t>
+      </w:r>
+    </w:p>
+    <w:bookmarkEnd w:id="34"/>
+    <w:bookmarkStart w:id="35" w:name="X5a9ef16e59be0ea9289efff74cbad45d36d77bb"/>
     <w:p>
       <w:pPr>
         <w:pStyle w:val="Heading3"/>
@@ -1153,7 +1260,7 @@
       <w:pPr>
         <w:numPr>
           <w:ilvl w:val="0"/>
-          <w:numId w:val="1004"/>
+          <w:numId w:val="1005"/>
         </w:numPr>
         <w:pStyle w:val="Compact"/>
       </w:pPr>
@@ -1165,7 +1272,7 @@
       <w:pPr>
         <w:numPr>
           <w:ilvl w:val="0"/>
-          <w:numId w:val="1004"/>
+          <w:numId w:val="1005"/>
         </w:numPr>
         <w:pStyle w:val="Compact"/>
       </w:pPr>
@@ -1173,8 +1280,8 @@
         <w:t xml:space="preserve">API .NET Core hébergée sur Azure, client WPF (Caliburn Micro).</w:t>
       </w:r>
     </w:p>
-    <w:bookmarkEnd w:id="34"/>
-    <w:bookmarkStart w:id="35" w:name="X1484c8a497e2df52127ffae1443cf8e91874a3d"/>
+    <w:bookmarkEnd w:id="35"/>
+    <w:bookmarkStart w:id="36" w:name="X1484c8a497e2df52127ffae1443cf8e91874a3d"/>
     <w:p>
       <w:pPr>
         <w:pStyle w:val="Heading3"/>
@@ -1203,8 +1310,8 @@
         <w:t xml:space="preserve">Formation d’alternants au développement full-stack, au Software Craft, au DevOps (CI/CD) et à la gestion de projet agile. Deux plateformes réalisées : facturation (MongoDB, Node.js, React, Stripe, Docker) et contrats d’apprentis (Vue.js, Sequelize).</w:t>
       </w:r>
     </w:p>
-    <w:bookmarkEnd w:id="35"/>
-    <w:bookmarkStart w:id="36" w:name="betclic-group-bordeaux-tech-lead"/>
+    <w:bookmarkEnd w:id="36"/>
+    <w:bookmarkStart w:id="37" w:name="betclic-group-bordeaux-tech-lead"/>
     <w:p>
       <w:pPr>
         <w:pStyle w:val="Heading3"/>
@@ -1237,7 +1344,7 @@
       <w:pPr>
         <w:numPr>
           <w:ilvl w:val="0"/>
-          <w:numId w:val="1005"/>
+          <w:numId w:val="1006"/>
         </w:numPr>
         <w:pStyle w:val="Compact"/>
       </w:pPr>
@@ -1249,7 +1356,7 @@
       <w:pPr>
         <w:numPr>
           <w:ilvl w:val="0"/>
-          <w:numId w:val="1005"/>
+          <w:numId w:val="1006"/>
         </w:numPr>
         <w:pStyle w:val="Compact"/>
       </w:pPr>
@@ -1261,7 +1368,7 @@
       <w:pPr>
         <w:numPr>
           <w:ilvl w:val="0"/>
-          <w:numId w:val="1005"/>
+          <w:numId w:val="1006"/>
         </w:numPr>
         <w:pStyle w:val="Compact"/>
       </w:pPr>
@@ -1269,8 +1376,8 @@
         <w:t xml:space="preserve">Revues de code, mises en production (TeamCity, Jenkins, Octopus).</w:t>
       </w:r>
     </w:p>
-    <w:bookmarkEnd w:id="36"/>
-    <w:bookmarkStart w:id="37" w:name="X0cdf2bb6935fa00dd9b8b631fdc955f44032d5e"/>
+    <w:bookmarkEnd w:id="37"/>
+    <w:bookmarkStart w:id="38" w:name="X0cdf2bb6935fa00dd9b8b631fdc955f44032d5e"/>
     <w:p>
       <w:pPr>
         <w:pStyle w:val="Heading3"/>
@@ -1299,8 +1406,8 @@
         <w:t xml:space="preserve">Maintenance de XOne (Forex Cash) : refonte des tests unitaires (NUnit, Moq), procédures PL/SQL sur Oracle.</w:t>
       </w:r>
     </w:p>
-    <w:bookmarkEnd w:id="37"/>
-    <w:bookmarkStart w:id="38" w:name="ag-insurance-bruxelles-lead-developer"/>
+    <w:bookmarkEnd w:id="38"/>
+    <w:bookmarkStart w:id="39" w:name="ag-insurance-bruxelles-lead-developer"/>
     <w:p>
       <w:pPr>
         <w:pStyle w:val="Heading3"/>
@@ -1329,8 +1436,8 @@
         <w:t xml:space="preserve">Évolution d’une application web qui pilote les calculs d’une grille AFM et remplace un outil Excel. Back-end WCF, écrans ASP.NET MVC.</w:t>
       </w:r>
     </w:p>
-    <w:bookmarkEnd w:id="38"/>
-    <w:bookmarkStart w:id="39" w:name="X6e959d482d99b4b04040d4878ab680f6eaf8fe7"/>
+    <w:bookmarkEnd w:id="39"/>
+    <w:bookmarkStart w:id="40" w:name="X6e959d482d99b4b04040d4878ab680f6eaf8fe7"/>
     <w:p>
       <w:pPr>
         <w:pStyle w:val="Heading3"/>
@@ -1359,8 +1466,8 @@
         <w:t xml:space="preserve">Migration de batchs VB et VB.NET vers C# .NET 4 : inventaire des applications, étude des dépendances, KPI, développement en TDD.</w:t>
       </w:r>
     </w:p>
-    <w:bookmarkEnd w:id="39"/>
-    <w:bookmarkStart w:id="40" w:name="X6990560913d7d143c03c310b2e29a4877869ccb"/>
+    <w:bookmarkEnd w:id="40"/>
+    <w:bookmarkStart w:id="41" w:name="X6990560913d7d143c03c310b2e29a4877869ccb"/>
     <w:p>
       <w:pPr>
         <w:pStyle w:val="Heading3"/>
@@ -1389,8 +1496,8 @@
         <w:t xml:space="preserve">Évolutions de l’application de gestion des garanties et cautionnements (ASP.NET, WinForms, WCF, SSRS) : spécifications techniques, architecture, packaging et recette. Audit de performance pour BPCE en 07/2014.</w:t>
       </w:r>
     </w:p>
-    <w:bookmarkEnd w:id="40"/>
-    <w:bookmarkStart w:id="41" w:name="missions-antérieures-2006-2014"/>
+    <w:bookmarkEnd w:id="41"/>
+    <w:bookmarkStart w:id="42" w:name="missions-antérieures-2006-2014"/>
     <w:p>
       <w:pPr>
         <w:pStyle w:val="Heading3"/>
@@ -1403,7 +1510,7 @@
       <w:pPr>
         <w:numPr>
           <w:ilvl w:val="0"/>
-          <w:numId w:val="1006"/>
+          <w:numId w:val="1007"/>
         </w:numPr>
         <w:pStyle w:val="Compact"/>
       </w:pPr>
@@ -1425,7 +1532,7 @@
       <w:pPr>
         <w:numPr>
           <w:ilvl w:val="0"/>
-          <w:numId w:val="1006"/>
+          <w:numId w:val="1007"/>
         </w:numPr>
         <w:pStyle w:val="Compact"/>
       </w:pPr>
@@ -1447,7 +1554,7 @@
       <w:pPr>
         <w:numPr>
           <w:ilvl w:val="0"/>
-          <w:numId w:val="1006"/>
+          <w:numId w:val="1007"/>
         </w:numPr>
         <w:pStyle w:val="Compact"/>
       </w:pPr>
@@ -1469,7 +1576,7 @@
       <w:pPr>
         <w:numPr>
           <w:ilvl w:val="0"/>
-          <w:numId w:val="1006"/>
+          <w:numId w:val="1007"/>
         </w:numPr>
         <w:pStyle w:val="Compact"/>
       </w:pPr>
@@ -1491,7 +1598,7 @@
       <w:pPr>
         <w:numPr>
           <w:ilvl w:val="0"/>
-          <w:numId w:val="1006"/>
+          <w:numId w:val="1007"/>
         </w:numPr>
         <w:pStyle w:val="Compact"/>
       </w:pPr>
@@ -1509,9 +1616,9 @@
         <w:t xml:space="preserve">(2006 – 2009) : logiciels industriels, administration de bases de données, PDM.</w:t>
       </w:r>
     </w:p>
-    <w:bookmarkEnd w:id="41"/>
     <w:bookmarkEnd w:id="42"/>
-    <w:bookmarkStart w:id="43" w:name="formation-et-langues"/>
+    <w:bookmarkEnd w:id="43"/>
+    <w:bookmarkStart w:id="44" w:name="formation-et-langues"/>
     <w:p>
       <w:pPr>
         <w:pStyle w:val="Heading2"/>
@@ -1524,7 +1631,7 @@
       <w:pPr>
         <w:numPr>
           <w:ilvl w:val="0"/>
-          <w:numId w:val="1007"/>
+          <w:numId w:val="1008"/>
         </w:numPr>
         <w:pStyle w:val="Compact"/>
       </w:pPr>
@@ -1546,7 +1653,7 @@
       <w:pPr>
         <w:numPr>
           <w:ilvl w:val="0"/>
-          <w:numId w:val="1007"/>
+          <w:numId w:val="1008"/>
         </w:numPr>
         <w:pStyle w:val="Compact"/>
       </w:pPr>
@@ -1568,7 +1675,7 @@
       <w:pPr>
         <w:numPr>
           <w:ilvl w:val="0"/>
-          <w:numId w:val="1007"/>
+          <w:numId w:val="1008"/>
         </w:numPr>
         <w:pStyle w:val="Compact"/>
       </w:pPr>
@@ -1604,8 +1711,8 @@
         <w:t xml:space="preserve">(chefs de projet et team leaders chez CEGC/BPCE, Banque de France, ACPR) disponibles sur demande.</w:t>
       </w:r>
     </w:p>
-    <w:bookmarkEnd w:id="43"/>
     <w:bookmarkEnd w:id="44"/>
+    <w:bookmarkEnd w:id="45"/>
     <w:sectPr/>
   </w:body>
 </w:document>
@@ -1810,6 +1917,9 @@
     <w:abstractNumId w:val="991"/>
   </w:num>
   <w:num w:numId="1007">
+    <w:abstractNumId w:val="991"/>
+  </w:num>
+  <w:num w:numId="1008">
     <w:abstractNumId w:val="991"/>
   </w:num>
 </w:numbering>

</xml_diff>

<commit_message>
Sogecap : programme 2026 (HpcLite, pilotage agile, DevOps), CV FR/EN
- Expérience Sogecap : bloc « Migration de la plateforme de calcul (2026) »
  (conception de HpcLite, orchestration en DAG, pilotage agile, déploiement
  PowerShell validé par 167 scénarios, CI/CD GitLab en cours).
- Retrait du nom XGrid (grille de calcul interne du Groupe).
- Présentation : architecture et industrialisation de la livraison.
- CV FR et EN régénérés (expériences avant les sections IA et projets).
- Version de cache passée à 20261019.

Co-Authored-By: Claude Opus 5.5 <noreply@anthropic.com>
Claude-Session: https://claude.ai/code/session_01AXVNFt21u7UcfptizFrBPr
</commit_message>
<xml_diff>
--- a/resources/docs/biahprofile.docx
+++ b/resources/docs/biahprofile.docx
@@ -28,7 +28,7 @@
         <w:pStyle w:val="BodyText"/>
       </w:pPr>
       <w:r>
-        <w:t xml:space="preserve">Tech Lead freelance avec 20 ans d’expérience dans la banque et l’assurance. Je pilote des équipes et des applications de calcul financier et actuariel (ALM, AFM, HPC) et je modernise des applications legacy (WinForms, WPF, VB) vers .NET Core et React. J’intègre l’IA générative (API Anthropic, agents de code) dans mes produits et mes pratiques d’équipe.</w:t>
+        <w:t xml:space="preserve">Tech Lead freelance avec 20 ans d’expérience dans la banque et l’assurance. Je pilote des équipes et des applications de calcul financier et actuariel (ALM, AFM, HPC), j’en conçois l’architecture et j’industrialise leur livraison (CI/CD, déploiement automatisé). Je modernise des applications legacy (WinForms, WPF, VB) vers .NET Core et React. J’intègre l’IA générative (API Anthropic, agents de code) dans mes produits et mes pratiques d’équipe.</w:t>
       </w:r>
     </w:p>
     <w:p>
@@ -173,7 +173,7 @@
               <w:jc w:val="left"/>
             </w:pPr>
             <w:r>
-              <w:t xml:space="preserve">C#, .NET Core, ASP.NET MVC, Node.js / Express, Python / FastAPI, API REST, SignalR, WCF, RabbitMQ</w:t>
+              <w:t xml:space="preserve">C#, .NET 8 / .NET Core, ASP.NET Core, ASP.NET MVC, services Windows, Node.js / Express, Python / FastAPI, API REST, SignalR, WCF, RabbitMQ</w:t>
             </w:r>
           </w:p>
         </w:tc>
@@ -251,7 +251,7 @@
               <w:jc w:val="left"/>
             </w:pPr>
             <w:r>
-              <w:t xml:space="preserve">Azure, Docker, Kubernetes, Ansible, Jenkins, GitLab CI, TeamCity, Octopus, Vercel, Railway</w:t>
+              <w:t xml:space="preserve">PowerShell, IIS, NuGet, Artifactory, GitLab CI, Azure, Docker, Kubernetes, Ansible, Jenkins, TeamCity, Octopus, Vercel, Railway</w:t>
             </w:r>
           </w:p>
         </w:tc>
@@ -303,7 +303,7 @@
               <w:jc w:val="left"/>
             </w:pPr>
             <w:r>
-              <w:t xml:space="preserve">Grilles de calcul ALM et AFM, MS HPC, XGrid (Société Générale), monitoring de jobs en temps réel</w:t>
+              <w:t xml:space="preserve">Grilles de calcul ALM et AFM, MS HPC, orchestration de calcul distribué (HpcLite), dépendances en DAG, monitoring de jobs en temps réel</w:t>
             </w:r>
           </w:p>
         </w:tc>
@@ -355,7 +355,7 @@
               <w:jc w:val="left"/>
             </w:pPr>
             <w:r>
-              <w:t xml:space="preserve">Scrum, Kanban, Software Craft, SOLID, design patterns (GoF), UML</w:t>
+              <w:t xml:space="preserve">Scrum, Kanban, backlog Epic / Feature / User Story, Jira, Software Craft, SOLID, design patterns (GoF), UML</w:t>
             </w:r>
           </w:p>
         </w:tc>
@@ -380,7 +380,848 @@
       </w:r>
     </w:p>
     <w:bookmarkEnd w:id="24"/>
-    <w:bookmarkStart w:id="25" w:name="ia-générative"/>
+    <w:bookmarkStart w:id="37" w:name="expériences"/>
+    <w:p>
+      <w:pPr>
+        <w:pStyle w:val="Heading2"/>
+      </w:pPr>
+      <w:r>
+        <w:t xml:space="preserve">Expériences</w:t>
+      </w:r>
+    </w:p>
+    <w:bookmarkStart w:id="25" w:name="X6d0f917f60ac00492536af6a829068bcd2715b1"/>
+    <w:p>
+      <w:pPr>
+        <w:pStyle w:val="Heading3"/>
+      </w:pPr>
+      <w:r>
+        <w:t xml:space="preserve">Sogecap (Société Générale Assurances), Paris — Chef de projet technique / Tech Lead (salarié)</w:t>
+      </w:r>
+    </w:p>
+    <w:p>
+      <w:pPr>
+        <w:pStyle w:val="FirstParagraph"/>
+      </w:pPr>
+      <w:r>
+        <w:rPr>
+          <w:bCs/>
+          <w:b/>
+        </w:rPr>
+        <w:t xml:space="preserve">Depuis 03/2021</w:t>
+      </w:r>
+    </w:p>
+    <w:p>
+      <w:pPr>
+        <w:pStyle w:val="BodyText"/>
+      </w:pPr>
+      <w:r>
+        <w:t xml:space="preserve">Applications de lancement et de supervision des calculs actuariels (ALM), pour les actuaires. Équipe agile de 7, dont 3 développeurs front encadrés.</w:t>
+      </w:r>
+    </w:p>
+    <w:p>
+      <w:pPr>
+        <w:pStyle w:val="BodyText"/>
+      </w:pPr>
+      <w:r>
+        <w:rPr>
+          <w:bCs/>
+          <w:b/>
+        </w:rPr>
+        <w:t xml:space="preserve">Migration de la plateforme de calcul (2026) — POC validé, développement en voie d’achèvement</w:t>
+      </w:r>
+    </w:p>
+    <w:p>
+      <w:pPr>
+        <w:numPr>
+          <w:ilvl w:val="0"/>
+          <w:numId w:val="1001"/>
+        </w:numPr>
+        <w:pStyle w:val="Compact"/>
+      </w:pPr>
+      <w:r>
+        <w:t xml:space="preserve">Conçu</w:t>
+      </w:r>
+      <w:r>
+        <w:t xml:space="preserve"> </w:t>
+      </w:r>
+      <w:r>
+        <w:rPr>
+          <w:bCs/>
+          <w:b/>
+        </w:rPr>
+        <w:t xml:space="preserve">HpcLite</w:t>
+      </w:r>
+      <w:r>
+        <w:t xml:space="preserve">, une couche d’orchestration en .NET 8 qui reprend la logique de Microsoft HPC (ordonnanceur, agents et exécuteurs en services Windows) et soumet les tâches à la grille de calcul interne du Groupe.</w:t>
+      </w:r>
+    </w:p>
+    <w:p>
+      <w:pPr>
+        <w:numPr>
+          <w:ilvl w:val="0"/>
+          <w:numId w:val="1001"/>
+        </w:numPr>
+        <w:pStyle w:val="Compact"/>
+      </w:pPr>
+      <w:r>
+        <w:t xml:space="preserve">Développé l’orchestration des calculs : API REST, dépendances entre jobs en graphe (DAG), machine à états, détection des plantages, répartition concurrente sûre sur PostgreSQL (</w:t>
+      </w:r>
+      <w:r>
+        <w:rPr>
+          <w:rStyle w:val="VerbatimChar"/>
+        </w:rPr>
+        <w:t xml:space="preserve">SKIP LOCKED</w:t>
+      </w:r>
+      <w:r>
+        <w:t xml:space="preserve">), en s’intégrant au modèle de données existant (Dapper).</w:t>
+      </w:r>
+    </w:p>
+    <w:p>
+      <w:pPr>
+        <w:numPr>
+          <w:ilvl w:val="0"/>
+          <w:numId w:val="1001"/>
+        </w:numPr>
+        <w:pStyle w:val="Compact"/>
+      </w:pPr>
+      <w:r>
+        <w:t xml:space="preserve">Appliqué le moindre privilège (agents de calcul sans accès à la base) et documenté l’architecture cible.</w:t>
+      </w:r>
+    </w:p>
+    <w:p>
+      <w:pPr>
+        <w:numPr>
+          <w:ilvl w:val="0"/>
+          <w:numId w:val="1001"/>
+        </w:numPr>
+        <w:pStyle w:val="Compact"/>
+      </w:pPr>
+      <w:r>
+        <w:t xml:space="preserve">Spécifié l’interface de soumission des calculs sur un design system commun à deux applications.</w:t>
+      </w:r>
+    </w:p>
+    <w:p>
+      <w:pPr>
+        <w:numPr>
+          <w:ilvl w:val="0"/>
+          <w:numId w:val="1001"/>
+        </w:numPr>
+        <w:pStyle w:val="Compact"/>
+      </w:pPr>
+      <w:r>
+        <w:t xml:space="preserve">Mis en place le pilotage agile : backlog Epic → Feature → User Story, sprints suivis par milestones GitLab, modèle de ticket Jira standardisé (contexte, livrables, critères d’acceptation) ; piloté le chantier de migration web (plan projet, démos, recettes, livraisons).</w:t>
+      </w:r>
+    </w:p>
+    <w:p>
+      <w:pPr>
+        <w:numPr>
+          <w:ilvl w:val="0"/>
+          <w:numId w:val="1001"/>
+        </w:numPr>
+        <w:pStyle w:val="Compact"/>
+      </w:pPr>
+      <w:r>
+        <w:t xml:space="preserve">Automatisé le déploiement de bout en bout en PowerShell (Artifactory → IIS et services Windows, contrôle préalable, rollback), validé par 19 jalons et 167 scénarios de test jusqu’à la mise en production ; scripts et documentation livrés à l’équipe d’exploitation.</w:t>
+      </w:r>
+    </w:p>
+    <w:p>
+      <w:pPr>
+        <w:numPr>
+          <w:ilvl w:val="0"/>
+          <w:numId w:val="1001"/>
+        </w:numPr>
+        <w:pStyle w:val="Compact"/>
+      </w:pPr>
+      <w:r>
+        <w:t xml:space="preserve">En cours : CI/CD GitLab pour une équipe .NET non couverte par la plateforme DevOps du Groupe (Java uniquement). Revue des scripts de build : suppression d’un secret en dur et des faux succès de publication.</w:t>
+      </w:r>
+    </w:p>
+    <w:p>
+      <w:pPr>
+        <w:numPr>
+          <w:ilvl w:val="0"/>
+          <w:numId w:val="1001"/>
+        </w:numPr>
+        <w:pStyle w:val="Compact"/>
+      </w:pPr>
+      <w:r>
+        <w:t xml:space="preserve">Spécifications itératives avec Claude Code pour générer les squelettes de code et l’interface.</w:t>
+      </w:r>
+    </w:p>
+    <w:p>
+      <w:pPr>
+        <w:pStyle w:val="FirstParagraph"/>
+      </w:pPr>
+      <w:r>
+        <w:rPr>
+          <w:bCs/>
+          <w:b/>
+        </w:rPr>
+        <w:t xml:space="preserve">Refonte de l’application de lancement des calculs ALM</w:t>
+      </w:r>
+    </w:p>
+    <w:p>
+      <w:pPr>
+        <w:numPr>
+          <w:ilvl w:val="0"/>
+          <w:numId w:val="1002"/>
+        </w:numPr>
+        <w:pStyle w:val="Compact"/>
+      </w:pPr>
+      <w:r>
+        <w:t xml:space="preserve">Refonte de l’application WPF en application web React, et maintenance de la version WPF.</w:t>
+      </w:r>
+    </w:p>
+    <w:p>
+      <w:pPr>
+        <w:numPr>
+          <w:ilvl w:val="0"/>
+          <w:numId w:val="1002"/>
+        </w:numPr>
+        <w:pStyle w:val="Compact"/>
+      </w:pPr>
+      <w:r>
+        <w:t xml:space="preserve">Réarchitecture de la solution (GoF, SOLID, Software Craft) ; tests unitaires (NUnit, Moq) et couverture de code suivie dans SonarQube.</w:t>
+      </w:r>
+    </w:p>
+    <w:p>
+      <w:pPr>
+        <w:numPr>
+          <w:ilvl w:val="0"/>
+          <w:numId w:val="1002"/>
+        </w:numPr>
+        <w:pStyle w:val="Compact"/>
+      </w:pPr>
+      <w:r>
+        <w:t xml:space="preserve">Refonte du monitoring pour suivre les jobs de calcul en temps réel.</w:t>
+      </w:r>
+    </w:p>
+    <w:p>
+      <w:pPr>
+        <w:numPr>
+          <w:ilvl w:val="0"/>
+          <w:numId w:val="1002"/>
+        </w:numPr>
+        <w:pStyle w:val="Compact"/>
+      </w:pPr>
+      <w:r>
+        <w:t xml:space="preserve">Pilotage Scrum et interface avec les actuaires, les éditeurs de progiciels (bugs, licences) et la DSI (DevOps, serveurs, HPC).</w:t>
+      </w:r>
+    </w:p>
+    <w:p>
+      <w:pPr>
+        <w:pStyle w:val="FirstParagraph"/>
+      </w:pPr>
+      <w:r>
+        <w:rPr>
+          <w:iCs/>
+          <w:i/>
+        </w:rPr>
+        <w:t xml:space="preserve">Stack : C#, .NET 8, ASP.NET Core, Kestrel, services Windows, Dapper, PostgreSQL, React, Node.js, MVC, WPF, PowerShell, IIS, NuGet, Artifactory, GitLab, Jira, Jenkins, Ansible, Kubernetes, MS HPC, Claude Code</w:t>
+      </w:r>
+    </w:p>
+    <w:bookmarkEnd w:id="25"/>
+    <w:bookmarkStart w:id="26" w:name="X86c7619151c172a18089aada8627beba9fae811"/>
+    <w:p>
+      <w:pPr>
+        <w:pStyle w:val="Heading3"/>
+      </w:pPr>
+      <w:r>
+        <w:t xml:space="preserve">Les Rappelés, Tallinn (Estonie) — Lead Developer (projet mené en parallèle)</w:t>
+      </w:r>
+    </w:p>
+    <w:p>
+      <w:pPr>
+        <w:pStyle w:val="FirstParagraph"/>
+      </w:pPr>
+      <w:r>
+        <w:rPr>
+          <w:bCs/>
+          <w:b/>
+        </w:rPr>
+        <w:t xml:space="preserve">03/2025 – 08/2025</w:t>
+      </w:r>
+    </w:p>
+    <w:p>
+      <w:pPr>
+        <w:pStyle w:val="BodyText"/>
+      </w:pPr>
+      <w:r>
+        <w:t xml:space="preserve">Conception et livraison de la plateforme Lissen, de l’application mobile au back-end.</w:t>
+      </w:r>
+    </w:p>
+    <w:p>
+      <w:pPr>
+        <w:numPr>
+          <w:ilvl w:val="0"/>
+          <w:numId w:val="1003"/>
+        </w:numPr>
+        <w:pStyle w:val="Compact"/>
+      </w:pPr>
+      <w:r>
+        <w:t xml:space="preserve">Application mobile Expo / React Native publiée sur Google Play.</w:t>
+      </w:r>
+    </w:p>
+    <w:p>
+      <w:pPr>
+        <w:numPr>
+          <w:ilvl w:val="0"/>
+          <w:numId w:val="1003"/>
+        </w:numPr>
+        <w:pStyle w:val="Compact"/>
+      </w:pPr>
+      <w:r>
+        <w:t xml:space="preserve">Site web Next.js / React déployé sur Vercel.</w:t>
+      </w:r>
+    </w:p>
+    <w:p>
+      <w:pPr>
+        <w:numPr>
+          <w:ilvl w:val="0"/>
+          <w:numId w:val="1003"/>
+        </w:numPr>
+        <w:pStyle w:val="Compact"/>
+      </w:pPr>
+      <w:r>
+        <w:t xml:space="preserve">Back-end « Forge » en Node.js / Express (API REST) sur Railway.</w:t>
+      </w:r>
+    </w:p>
+    <w:p>
+      <w:pPr>
+        <w:numPr>
+          <w:ilvl w:val="0"/>
+          <w:numId w:val="1003"/>
+        </w:numPr>
+        <w:pStyle w:val="Compact"/>
+      </w:pPr>
+      <w:r>
+        <w:t xml:space="preserve">CI/CD Vercel et Railway, suivi des crashs et des performances (Sentry, Crashlytics).</w:t>
+      </w:r>
+    </w:p>
+    <w:p>
+      <w:pPr>
+        <w:numPr>
+          <w:ilvl w:val="0"/>
+          <w:numId w:val="1003"/>
+        </w:numPr>
+        <w:pStyle w:val="Compact"/>
+      </w:pPr>
+      <w:r>
+        <w:t xml:space="preserve">Automatisations et assistance par IA (API Anthropic, OpenAI).</w:t>
+      </w:r>
+    </w:p>
+    <w:p>
+      <w:pPr>
+        <w:pStyle w:val="FirstParagraph"/>
+      </w:pPr>
+      <w:r>
+        <w:rPr>
+          <w:iCs/>
+          <w:i/>
+        </w:rPr>
+        <w:t xml:space="preserve">Stack : React Native, Expo, Next.js, Node.js, Express, PostgreSQL, IndexedDB, GitHub</w:t>
+      </w:r>
+    </w:p>
+    <w:bookmarkEnd w:id="26"/>
+    <w:bookmarkStart w:id="28" w:name="Xc8a9c315e407c63ad25ef2aa395774123bc5098"/>
+    <w:p>
+      <w:pPr>
+        <w:pStyle w:val="Heading3"/>
+      </w:pPr>
+      <w:r>
+        <w:t xml:space="preserve">Ektare Immo, Nairobi (Kenya) — Chef de projet (projet mené en parallèle)</w:t>
+      </w:r>
+    </w:p>
+    <w:p>
+      <w:pPr>
+        <w:pStyle w:val="FirstParagraph"/>
+      </w:pPr>
+      <w:r>
+        <w:rPr>
+          <w:bCs/>
+          <w:b/>
+        </w:rPr>
+        <w:t xml:space="preserve">06/2023 – 12/2023</w:t>
+      </w:r>
+    </w:p>
+    <w:p>
+      <w:pPr>
+        <w:pStyle w:val="BodyText"/>
+      </w:pPr>
+      <w:r>
+        <w:t xml:space="preserve">Conception et réalisation d’une application de gestion immobilière pour la diaspora kényane, avec une équipe de 6.</w:t>
+      </w:r>
+    </w:p>
+    <w:p>
+      <w:pPr>
+        <w:numPr>
+          <w:ilvl w:val="0"/>
+          <w:numId w:val="1004"/>
+        </w:numPr>
+        <w:pStyle w:val="Compact"/>
+      </w:pPr>
+      <w:r>
+        <w:t xml:space="preserve">Modélisation de la solution (front, middle, back) et implémentation du middle et du back.</w:t>
+      </w:r>
+    </w:p>
+    <w:p>
+      <w:pPr>
+        <w:numPr>
+          <w:ilvl w:val="0"/>
+          <w:numId w:val="1004"/>
+        </w:numPr>
+        <w:pStyle w:val="Compact"/>
+      </w:pPr>
+      <w:r>
+        <w:t xml:space="preserve">Base MongoDB et API REST (OpenAPI, architecture Controller / Service / Repository).</w:t>
+      </w:r>
+    </w:p>
+    <w:p>
+      <w:pPr>
+        <w:numPr>
+          <w:ilvl w:val="0"/>
+          <w:numId w:val="1004"/>
+        </w:numPr>
+        <w:pStyle w:val="Compact"/>
+      </w:pPr>
+      <w:r>
+        <w:t xml:space="preserve">Application React pour le middle-office, site vitrine</w:t>
+      </w:r>
+      <w:r>
+        <w:t xml:space="preserve"> </w:t>
+      </w:r>
+      <w:hyperlink r:id="rId27">
+        <w:r>
+          <w:rPr>
+            <w:rStyle w:val="Hyperlink"/>
+          </w:rPr>
+          <w:t xml:space="preserve">hektare-immo.com</w:t>
+        </w:r>
+      </w:hyperlink>
+      <w:r>
+        <w:t xml:space="preserve"> </w:t>
+      </w:r>
+      <w:r>
+        <w:t xml:space="preserve">(HTML5, CSS3, jQuery).</w:t>
+      </w:r>
+    </w:p>
+    <w:p>
+      <w:pPr>
+        <w:numPr>
+          <w:ilvl w:val="0"/>
+          <w:numId w:val="1004"/>
+        </w:numPr>
+        <w:pStyle w:val="Compact"/>
+      </w:pPr>
+      <w:r>
+        <w:t xml:space="preserve">Pilotage Scrum / Kanban de l’équipe.</w:t>
+      </w:r>
+    </w:p>
+    <w:p>
+      <w:pPr>
+        <w:pStyle w:val="FirstParagraph"/>
+      </w:pPr>
+      <w:r>
+        <w:rPr>
+          <w:iCs/>
+          <w:i/>
+        </w:rPr>
+        <w:t xml:space="preserve">Stack : React, Node.js, Express, MongoDB, API REST, Git, GitHub</w:t>
+      </w:r>
+    </w:p>
+    <w:bookmarkEnd w:id="28"/>
+    <w:bookmarkStart w:id="29" w:name="X5a9ef16e59be0ea9289efff74cbad45d36d77bb"/>
+    <w:p>
+      <w:pPr>
+        <w:pStyle w:val="Heading3"/>
+      </w:pPr>
+      <w:r>
+        <w:t xml:space="preserve">Binas Group, Bruxelles — Chef de projet technique</w:t>
+      </w:r>
+    </w:p>
+    <w:p>
+      <w:pPr>
+        <w:pStyle w:val="FirstParagraph"/>
+      </w:pPr>
+      <w:r>
+        <w:rPr>
+          <w:bCs/>
+          <w:b/>
+        </w:rPr>
+        <w:t xml:space="preserve">11/2020 – 01/2021</w:t>
+      </w:r>
+    </w:p>
+    <w:p>
+      <w:pPr>
+        <w:pStyle w:val="BodyText"/>
+      </w:pPr>
+      <w:r>
+        <w:t xml:space="preserve">Développement ex nihilo d’un PDM de gestion de contacts, avec une équipe de 3.</w:t>
+      </w:r>
+    </w:p>
+    <w:p>
+      <w:pPr>
+        <w:numPr>
+          <w:ilvl w:val="0"/>
+          <w:numId w:val="1005"/>
+        </w:numPr>
+        <w:pStyle w:val="Compact"/>
+      </w:pPr>
+      <w:r>
+        <w:t xml:space="preserve">Architecture de la solution, base SQL Server et ORM Dapper.</w:t>
+      </w:r>
+    </w:p>
+    <w:p>
+      <w:pPr>
+        <w:numPr>
+          <w:ilvl w:val="0"/>
+          <w:numId w:val="1005"/>
+        </w:numPr>
+        <w:pStyle w:val="Compact"/>
+      </w:pPr>
+      <w:r>
+        <w:t xml:space="preserve">API .NET Core hébergée sur Azure, client WPF (Caliburn Micro).</w:t>
+      </w:r>
+    </w:p>
+    <w:bookmarkEnd w:id="29"/>
+    <w:bookmarkStart w:id="30" w:name="X1484c8a497e2df52127ffae1443cf8e91874a3d"/>
+    <w:p>
+      <w:pPr>
+        <w:pStyle w:val="Heading3"/>
+      </w:pPr>
+      <w:r>
+        <w:t xml:space="preserve">Sinequanone Institute, Bezons — Formateur Master 1 et 2</w:t>
+      </w:r>
+    </w:p>
+    <w:p>
+      <w:pPr>
+        <w:pStyle w:val="FirstParagraph"/>
+      </w:pPr>
+      <w:r>
+        <w:rPr>
+          <w:bCs/>
+          <w:b/>
+        </w:rPr>
+        <w:t xml:space="preserve">Depuis 08/2020</w:t>
+      </w:r>
+    </w:p>
+    <w:p>
+      <w:pPr>
+        <w:pStyle w:val="BodyText"/>
+      </w:pPr>
+      <w:r>
+        <w:t xml:space="preserve">Formation d’alternants au développement full-stack, au Software Craft, au DevOps (CI/CD) et à la gestion de projet agile. Deux plateformes réalisées : facturation (MongoDB, Node.js, React, Stripe, Docker) et contrats d’apprentis (Vue.js, Sequelize).</w:t>
+      </w:r>
+    </w:p>
+    <w:bookmarkEnd w:id="30"/>
+    <w:bookmarkStart w:id="31" w:name="betclic-group-bordeaux-tech-lead"/>
+    <w:p>
+      <w:pPr>
+        <w:pStyle w:val="Heading3"/>
+      </w:pPr>
+      <w:r>
+        <w:t xml:space="preserve">Betclic Group, Bordeaux — Tech Lead</w:t>
+      </w:r>
+    </w:p>
+    <w:p>
+      <w:pPr>
+        <w:pStyle w:val="FirstParagraph"/>
+      </w:pPr>
+      <w:r>
+        <w:rPr>
+          <w:bCs/>
+          <w:b/>
+        </w:rPr>
+        <w:t xml:space="preserve">11/2019 – 10/2020</w:t>
+      </w:r>
+    </w:p>
+    <w:p>
+      <w:pPr>
+        <w:pStyle w:val="BodyText"/>
+      </w:pPr>
+      <w:r>
+        <w:t xml:space="preserve">Tech Lead d’un groupe de 4 dans une équipe de 20, sur la refonte de services Windows et d’API REST.</w:t>
+      </w:r>
+    </w:p>
+    <w:p>
+      <w:pPr>
+        <w:numPr>
+          <w:ilvl w:val="0"/>
+          <w:numId w:val="1006"/>
+        </w:numPr>
+        <w:pStyle w:val="Compact"/>
+      </w:pPr>
+      <w:r>
+        <w:t xml:space="preserve">API recevant en temps réel les messages des brokers sur les matchs (RabbitMQ).</w:t>
+      </w:r>
+    </w:p>
+    <w:p>
+      <w:pPr>
+        <w:numPr>
+          <w:ilvl w:val="0"/>
+          <w:numId w:val="1006"/>
+        </w:numPr>
+        <w:pStyle w:val="Compact"/>
+      </w:pPr>
+      <w:r>
+        <w:t xml:space="preserve">Procédures stockées, ORM Dapper, monitoring Datadog et Kibana.</w:t>
+      </w:r>
+    </w:p>
+    <w:p>
+      <w:pPr>
+        <w:numPr>
+          <w:ilvl w:val="0"/>
+          <w:numId w:val="1006"/>
+        </w:numPr>
+        <w:pStyle w:val="Compact"/>
+      </w:pPr>
+      <w:r>
+        <w:t xml:space="preserve">Revues de code, mises en production (TeamCity, Jenkins, Octopus).</w:t>
+      </w:r>
+    </w:p>
+    <w:bookmarkEnd w:id="31"/>
+    <w:bookmarkStart w:id="32" w:name="X0cdf2bb6935fa00dd9b8b631fdc955f44032d5e"/>
+    <w:p>
+      <w:pPr>
+        <w:pStyle w:val="Heading3"/>
+      </w:pPr>
+      <w:r>
+        <w:t xml:space="preserve">Société Générale CIB, La Défense — Lead Developer</w:t>
+      </w:r>
+    </w:p>
+    <w:p>
+      <w:pPr>
+        <w:pStyle w:val="FirstParagraph"/>
+      </w:pPr>
+      <w:r>
+        <w:rPr>
+          <w:bCs/>
+          <w:b/>
+        </w:rPr>
+        <w:t xml:space="preserve">01/2019 – 09/2019</w:t>
+      </w:r>
+    </w:p>
+    <w:p>
+      <w:pPr>
+        <w:pStyle w:val="BodyText"/>
+      </w:pPr>
+      <w:r>
+        <w:t xml:space="preserve">Maintenance de XOne (Forex Cash) : refonte des tests unitaires (NUnit, Moq), procédures PL/SQL sur Oracle.</w:t>
+      </w:r>
+    </w:p>
+    <w:bookmarkEnd w:id="32"/>
+    <w:bookmarkStart w:id="33" w:name="ag-insurance-bruxelles-lead-developer"/>
+    <w:p>
+      <w:pPr>
+        <w:pStyle w:val="Heading3"/>
+      </w:pPr>
+      <w:r>
+        <w:t xml:space="preserve">AG Insurance, Bruxelles — Lead Developer</w:t>
+      </w:r>
+    </w:p>
+    <w:p>
+      <w:pPr>
+        <w:pStyle w:val="FirstParagraph"/>
+      </w:pPr>
+      <w:r>
+        <w:rPr>
+          <w:bCs/>
+          <w:b/>
+        </w:rPr>
+        <w:t xml:space="preserve">08/2017 – 08/2018</w:t>
+      </w:r>
+    </w:p>
+    <w:p>
+      <w:pPr>
+        <w:pStyle w:val="BodyText"/>
+      </w:pPr>
+      <w:r>
+        <w:t xml:space="preserve">Évolution d’une application web qui pilote les calculs d’une grille AFM et remplace un outil Excel. Back-end WCF, écrans ASP.NET MVC.</w:t>
+      </w:r>
+    </w:p>
+    <w:bookmarkEnd w:id="33"/>
+    <w:bookmarkStart w:id="34" w:name="X6e959d482d99b4b04040d4878ab680f6eaf8fe7"/>
+    <w:p>
+      <w:pPr>
+        <w:pStyle w:val="Heading3"/>
+      </w:pPr>
+      <w:r>
+        <w:t xml:space="preserve">Candriam Investors Group, Paris — Lead Developer / Architecte</w:t>
+      </w:r>
+    </w:p>
+    <w:p>
+      <w:pPr>
+        <w:pStyle w:val="FirstParagraph"/>
+      </w:pPr>
+      <w:r>
+        <w:rPr>
+          <w:bCs/>
+          <w:b/>
+        </w:rPr>
+        <w:t xml:space="preserve">11/2016 – 03/2017</w:t>
+      </w:r>
+    </w:p>
+    <w:p>
+      <w:pPr>
+        <w:pStyle w:val="BodyText"/>
+      </w:pPr>
+      <w:r>
+        <w:t xml:space="preserve">Migration de batchs VB et VB.NET vers C# .NET 4 : inventaire des applications, étude des dépendances, KPI, développement en TDD.</w:t>
+      </w:r>
+    </w:p>
+    <w:bookmarkEnd w:id="34"/>
+    <w:bookmarkStart w:id="35" w:name="X6990560913d7d143c03c310b2e29a4877869ccb"/>
+    <w:p>
+      <w:pPr>
+        <w:pStyle w:val="Heading3"/>
+      </w:pPr>
+      <w:r>
+        <w:t xml:space="preserve">CEGC (Groupe BPCE), La Défense — Lead Developer</w:t>
+      </w:r>
+    </w:p>
+    <w:p>
+      <w:pPr>
+        <w:pStyle w:val="FirstParagraph"/>
+      </w:pPr>
+      <w:r>
+        <w:rPr>
+          <w:bCs/>
+          <w:b/>
+        </w:rPr>
+        <w:t xml:space="preserve">10/2014 – 10/2016</w:t>
+      </w:r>
+    </w:p>
+    <w:p>
+      <w:pPr>
+        <w:pStyle w:val="BodyText"/>
+      </w:pPr>
+      <w:r>
+        <w:t xml:space="preserve">Évolutions de l’application de gestion des garanties et cautionnements (ASP.NET, WinForms, WCF, SSRS) : spécifications techniques, architecture, packaging et recette. Audit de performance pour BPCE en 07/2014.</w:t>
+      </w:r>
+    </w:p>
+    <w:bookmarkEnd w:id="35"/>
+    <w:bookmarkStart w:id="36" w:name="missions-antérieures-2006-2014"/>
+    <w:p>
+      <w:pPr>
+        <w:pStyle w:val="Heading3"/>
+      </w:pPr>
+      <w:r>
+        <w:t xml:space="preserve">Missions antérieures (2006 – 2014)</w:t>
+      </w:r>
+    </w:p>
+    <w:p>
+      <w:pPr>
+        <w:numPr>
+          <w:ilvl w:val="0"/>
+          <w:numId w:val="1007"/>
+        </w:numPr>
+        <w:pStyle w:val="Compact"/>
+      </w:pPr>
+      <w:r>
+        <w:rPr>
+          <w:bCs/>
+          <w:b/>
+        </w:rPr>
+        <w:t xml:space="preserve">Banque de France</w:t>
+      </w:r>
+      <w:r>
+        <w:t xml:space="preserve"> </w:t>
+      </w:r>
+      <w:r>
+        <w:t xml:space="preserve">(2013 – 2014) : Lead Developer VSTO sur Solvabilité II, ASP.NET MVC et SSIS.</w:t>
+      </w:r>
+    </w:p>
+    <w:p>
+      <w:pPr>
+        <w:numPr>
+          <w:ilvl w:val="0"/>
+          <w:numId w:val="1007"/>
+        </w:numPr>
+        <w:pStyle w:val="Compact"/>
+      </w:pPr>
+      <w:r>
+        <w:rPr>
+          <w:bCs/>
+          <w:b/>
+        </w:rPr>
+        <w:t xml:space="preserve">Crédit Agricole CIB</w:t>
+      </w:r>
+      <w:r>
+        <w:t xml:space="preserve"> </w:t>
+      </w:r>
+      <w:r>
+        <w:t xml:space="preserve">(2011 – 2012) : reporting du risque de contrepartie (VaR, PnL, stress), SSIS et SSAS.</w:t>
+      </w:r>
+    </w:p>
+    <w:p>
+      <w:pPr>
+        <w:numPr>
+          <w:ilvl w:val="0"/>
+          <w:numId w:val="1007"/>
+        </w:numPr>
+        <w:pStyle w:val="Compact"/>
+      </w:pPr>
+      <w:r>
+        <w:rPr>
+          <w:bCs/>
+          <w:b/>
+        </w:rPr>
+        <w:t xml:space="preserve">Société Générale CIB</w:t>
+      </w:r>
+      <w:r>
+        <w:t xml:space="preserve"> </w:t>
+      </w:r>
+      <w:r>
+        <w:t xml:space="preserve">(2010 – 2011) : connectivité marchés (Tradeweb, Bloomberg) sur les obligations d’État US, projet pilote Scrum.</w:t>
+      </w:r>
+    </w:p>
+    <w:p>
+      <w:pPr>
+        <w:numPr>
+          <w:ilvl w:val="0"/>
+          <w:numId w:val="1007"/>
+        </w:numPr>
+        <w:pStyle w:val="Compact"/>
+      </w:pPr>
+      <w:r>
+        <w:rPr>
+          <w:bCs/>
+          <w:b/>
+        </w:rPr>
+        <w:t xml:space="preserve">Natixis</w:t>
+      </w:r>
+      <w:r>
+        <w:t xml:space="preserve"> </w:t>
+      </w:r>
+      <w:r>
+        <w:t xml:space="preserve">(2009 – 2010) : applications de négociation de produits financiers.</w:t>
+      </w:r>
+    </w:p>
+    <w:p>
+      <w:pPr>
+        <w:numPr>
+          <w:ilvl w:val="0"/>
+          <w:numId w:val="1007"/>
+        </w:numPr>
+        <w:pStyle w:val="Compact"/>
+      </w:pPr>
+      <w:r>
+        <w:rPr>
+          <w:bCs/>
+          <w:b/>
+        </w:rPr>
+        <w:t xml:space="preserve">Itron, Newedge, C-Design Fashion</w:t>
+      </w:r>
+      <w:r>
+        <w:t xml:space="preserve"> </w:t>
+      </w:r>
+      <w:r>
+        <w:t xml:space="preserve">(2006 – 2009) : logiciels industriels, administration de bases de données, PDM.</w:t>
+      </w:r>
+    </w:p>
+    <w:bookmarkEnd w:id="36"/>
+    <w:bookmarkEnd w:id="37"/>
+    <w:bookmarkStart w:id="38" w:name="ia-générative"/>
     <w:p>
       <w:pPr>
         <w:pStyle w:val="Heading2"/>
@@ -413,7 +1254,7 @@
       <w:pPr>
         <w:numPr>
           <w:ilvl w:val="0"/>
-          <w:numId w:val="1001"/>
+          <w:numId w:val="1008"/>
         </w:numPr>
         <w:pStyle w:val="Compact"/>
       </w:pPr>
@@ -425,7 +1266,7 @@
       <w:pPr>
         <w:numPr>
           <w:ilvl w:val="0"/>
-          <w:numId w:val="1001"/>
+          <w:numId w:val="1008"/>
         </w:numPr>
         <w:pStyle w:val="Compact"/>
       </w:pPr>
@@ -437,7 +1278,7 @@
       <w:pPr>
         <w:numPr>
           <w:ilvl w:val="0"/>
-          <w:numId w:val="1001"/>
+          <w:numId w:val="1008"/>
         </w:numPr>
         <w:pStyle w:val="Compact"/>
       </w:pPr>
@@ -449,7 +1290,7 @@
       <w:pPr>
         <w:numPr>
           <w:ilvl w:val="0"/>
-          <w:numId w:val="1001"/>
+          <w:numId w:val="1008"/>
         </w:numPr>
         <w:pStyle w:val="Compact"/>
       </w:pPr>
@@ -461,7 +1302,7 @@
       <w:pPr>
         <w:numPr>
           <w:ilvl w:val="0"/>
-          <w:numId w:val="1001"/>
+          <w:numId w:val="1008"/>
         </w:numPr>
         <w:pStyle w:val="Compact"/>
       </w:pPr>
@@ -505,8 +1346,8 @@
         <w:t xml:space="preserve">— Claude Code et GitHub Copilot au quotidien, cadrés par des règles projet (CLAUDE.md) : principes SOLID imposés, aucune exécution SQL sans validation.</w:t>
       </w:r>
     </w:p>
-    <w:bookmarkEnd w:id="25"/>
-    <w:bookmarkStart w:id="31" w:name="réalisations-via-cyrano-conseil"/>
+    <w:bookmarkEnd w:id="38"/>
+    <w:bookmarkStart w:id="43" w:name="réalisations-via-cyrano-conseil"/>
     <w:p>
       <w:pPr>
         <w:pStyle w:val="Heading2"/>
@@ -584,7 +1425,7 @@
               <w:pStyle w:val="Compact"/>
               <w:jc w:val="left"/>
             </w:pPr>
-            <w:hyperlink r:id="rId26">
+            <w:hyperlink r:id="rId39">
               <w:r>
                 <w:rPr>
                   <w:rStyle w:val="Hyperlink"/>
@@ -703,7 +1544,7 @@
               <w:pStyle w:val="Compact"/>
               <w:jc w:val="left"/>
             </w:pPr>
-            <w:hyperlink r:id="rId27">
+            <w:hyperlink r:id="rId40">
               <w:r>
                 <w:rPr>
                   <w:rStyle w:val="Hyperlink"/>
@@ -746,7 +1587,7 @@
               <w:pStyle w:val="Compact"/>
               <w:jc w:val="left"/>
             </w:pPr>
-            <w:hyperlink r:id="rId28">
+            <w:hyperlink r:id="rId41">
               <w:r>
                 <w:rPr>
                   <w:rStyle w:val="Hyperlink"/>
@@ -789,7 +1630,7 @@
               <w:pStyle w:val="Compact"/>
               <w:jc w:val="left"/>
             </w:pPr>
-            <w:hyperlink r:id="rId29">
+            <w:hyperlink r:id="rId27">
               <w:r>
                 <w:rPr>
                   <w:rStyle w:val="Hyperlink"/>
@@ -832,7 +1673,7 @@
               <w:pStyle w:val="Compact"/>
               <w:jc w:val="left"/>
             </w:pPr>
-            <w:hyperlink r:id="rId30">
+            <w:hyperlink r:id="rId42">
               <w:r>
                 <w:rPr>
                   <w:rStyle w:val="Hyperlink"/>
@@ -906,717 +1747,6 @@
         </w:tc>
       </w:tr>
     </w:tbl>
-    <w:bookmarkEnd w:id="31"/>
-    <w:bookmarkStart w:id="43" w:name="expériences"/>
-    <w:p>
-      <w:pPr>
-        <w:pStyle w:val="Heading2"/>
-      </w:pPr>
-      <w:r>
-        <w:t xml:space="preserve">Expériences</w:t>
-      </w:r>
-    </w:p>
-    <w:bookmarkStart w:id="32" w:name="X6d0f917f60ac00492536af6a829068bcd2715b1"/>
-    <w:p>
-      <w:pPr>
-        <w:pStyle w:val="Heading3"/>
-      </w:pPr>
-      <w:r>
-        <w:t xml:space="preserve">Sogecap (Société Générale Assurances), Paris — Chef de projet technique / Tech Lead (salarié)</w:t>
-      </w:r>
-    </w:p>
-    <w:p>
-      <w:pPr>
-        <w:pStyle w:val="FirstParagraph"/>
-      </w:pPr>
-      <w:r>
-        <w:rPr>
-          <w:bCs/>
-          <w:b/>
-        </w:rPr>
-        <w:t xml:space="preserve">Depuis 03/2021</w:t>
-      </w:r>
-    </w:p>
-    <w:p>
-      <w:pPr>
-        <w:pStyle w:val="BodyText"/>
-      </w:pPr>
-      <w:r>
-        <w:t xml:space="preserve">Refonte web d’une application qui lance des calculs sur une grille ALM, pour les actuaires. Équipe agile de 7, dont 3 développeurs front encadrés.</w:t>
-      </w:r>
-    </w:p>
-    <w:p>
-      <w:pPr>
-        <w:numPr>
-          <w:ilvl w:val="0"/>
-          <w:numId w:val="1002"/>
-        </w:numPr>
-        <w:pStyle w:val="Compact"/>
-      </w:pPr>
-      <w:r>
-        <w:t xml:space="preserve">Refonte de l’application WPF en application web React, et maintenance de la version WPF.</w:t>
-      </w:r>
-    </w:p>
-    <w:p>
-      <w:pPr>
-        <w:numPr>
-          <w:ilvl w:val="0"/>
-          <w:numId w:val="1002"/>
-        </w:numPr>
-        <w:pStyle w:val="Compact"/>
-      </w:pPr>
-      <w:r>
-        <w:t xml:space="preserve">Réarchitecture de la solution (GoF, SOLID, Software Craft).</w:t>
-      </w:r>
-    </w:p>
-    <w:p>
-      <w:pPr>
-        <w:numPr>
-          <w:ilvl w:val="0"/>
-          <w:numId w:val="1002"/>
-        </w:numPr>
-        <w:pStyle w:val="Compact"/>
-      </w:pPr>
-      <w:r>
-        <w:t xml:space="preserve">Tests unitaires (NUnit, Moq) et couverture de code suivie dans SonarQube.</w:t>
-      </w:r>
-    </w:p>
-    <w:p>
-      <w:pPr>
-        <w:numPr>
-          <w:ilvl w:val="0"/>
-          <w:numId w:val="1002"/>
-        </w:numPr>
-        <w:pStyle w:val="Compact"/>
-      </w:pPr>
-      <w:r>
-        <w:t xml:space="preserve">Migration du moteur de calcul de MS HPC vers XGrid, la grille interne développée par GBTO (Société Générale), intégrée via son API .NET Core. Refonte du monitoring pour suivre les jobs en temps réel.</w:t>
-      </w:r>
-    </w:p>
-    <w:p>
-      <w:pPr>
-        <w:numPr>
-          <w:ilvl w:val="0"/>
-          <w:numId w:val="1002"/>
-        </w:numPr>
-        <w:pStyle w:val="Compact"/>
-      </w:pPr>
-      <w:r>
-        <w:t xml:space="preserve">Pilotage Scrum et interface avec les actuaires, les éditeurs de progiciels (bugs, licences) et la DSI (DevOps, serveurs, HPC).</w:t>
-      </w:r>
-    </w:p>
-    <w:p>
-      <w:pPr>
-        <w:pStyle w:val="FirstParagraph"/>
-      </w:pPr>
-      <w:r>
-        <w:rPr>
-          <w:iCs/>
-          <w:i/>
-        </w:rPr>
-        <w:t xml:space="preserve">Stack : C#, .NET Core, MVC, WPF, React, Node.js, Sequelize, PostgreSQL, Tailwind, GitLab, Jenkins, Ansible, Kubernetes, MS HPC, XGrid</w:t>
-      </w:r>
-    </w:p>
-    <w:bookmarkEnd w:id="32"/>
-    <w:bookmarkStart w:id="33" w:name="X86c7619151c172a18089aada8627beba9fae811"/>
-    <w:p>
-      <w:pPr>
-        <w:pStyle w:val="Heading3"/>
-      </w:pPr>
-      <w:r>
-        <w:t xml:space="preserve">Les Rappelés, Tallinn (Estonie) — Lead Developer (projet mené en parallèle)</w:t>
-      </w:r>
-    </w:p>
-    <w:p>
-      <w:pPr>
-        <w:pStyle w:val="FirstParagraph"/>
-      </w:pPr>
-      <w:r>
-        <w:rPr>
-          <w:bCs/>
-          <w:b/>
-        </w:rPr>
-        <w:t xml:space="preserve">03/2025 – 08/2025</w:t>
-      </w:r>
-    </w:p>
-    <w:p>
-      <w:pPr>
-        <w:pStyle w:val="BodyText"/>
-      </w:pPr>
-      <w:r>
-        <w:t xml:space="preserve">Conception et livraison de la plateforme Lissen, de l’application mobile au back-end.</w:t>
-      </w:r>
-    </w:p>
-    <w:p>
-      <w:pPr>
-        <w:numPr>
-          <w:ilvl w:val="0"/>
-          <w:numId w:val="1003"/>
-        </w:numPr>
-        <w:pStyle w:val="Compact"/>
-      </w:pPr>
-      <w:r>
-        <w:t xml:space="preserve">Application mobile Expo / React Native publiée sur Google Play.</w:t>
-      </w:r>
-    </w:p>
-    <w:p>
-      <w:pPr>
-        <w:numPr>
-          <w:ilvl w:val="0"/>
-          <w:numId w:val="1003"/>
-        </w:numPr>
-        <w:pStyle w:val="Compact"/>
-      </w:pPr>
-      <w:r>
-        <w:t xml:space="preserve">Site web Next.js / React déployé sur Vercel.</w:t>
-      </w:r>
-    </w:p>
-    <w:p>
-      <w:pPr>
-        <w:numPr>
-          <w:ilvl w:val="0"/>
-          <w:numId w:val="1003"/>
-        </w:numPr>
-        <w:pStyle w:val="Compact"/>
-      </w:pPr>
-      <w:r>
-        <w:t xml:space="preserve">Back-end « Forge » en Node.js / Express (API REST) sur Railway.</w:t>
-      </w:r>
-    </w:p>
-    <w:p>
-      <w:pPr>
-        <w:numPr>
-          <w:ilvl w:val="0"/>
-          <w:numId w:val="1003"/>
-        </w:numPr>
-        <w:pStyle w:val="Compact"/>
-      </w:pPr>
-      <w:r>
-        <w:t xml:space="preserve">CI/CD Vercel et Railway, suivi des crashs et des performances (Sentry, Crashlytics).</w:t>
-      </w:r>
-    </w:p>
-    <w:p>
-      <w:pPr>
-        <w:numPr>
-          <w:ilvl w:val="0"/>
-          <w:numId w:val="1003"/>
-        </w:numPr>
-        <w:pStyle w:val="Compact"/>
-      </w:pPr>
-      <w:r>
-        <w:t xml:space="preserve">Automatisations et assistance par IA (API Anthropic, OpenAI).</w:t>
-      </w:r>
-    </w:p>
-    <w:p>
-      <w:pPr>
-        <w:pStyle w:val="FirstParagraph"/>
-      </w:pPr>
-      <w:r>
-        <w:rPr>
-          <w:iCs/>
-          <w:i/>
-        </w:rPr>
-        <w:t xml:space="preserve">Stack : React Native, Expo, Next.js, Node.js, Express, PostgreSQL, IndexedDB, GitHub</w:t>
-      </w:r>
-    </w:p>
-    <w:bookmarkEnd w:id="33"/>
-    <w:bookmarkStart w:id="34" w:name="Xc8a9c315e407c63ad25ef2aa395774123bc5098"/>
-    <w:p>
-      <w:pPr>
-        <w:pStyle w:val="Heading3"/>
-      </w:pPr>
-      <w:r>
-        <w:t xml:space="preserve">Ektare Immo, Nairobi (Kenya) — Chef de projet (projet mené en parallèle)</w:t>
-      </w:r>
-    </w:p>
-    <w:p>
-      <w:pPr>
-        <w:pStyle w:val="FirstParagraph"/>
-      </w:pPr>
-      <w:r>
-        <w:rPr>
-          <w:bCs/>
-          <w:b/>
-        </w:rPr>
-        <w:t xml:space="preserve">06/2023 – 12/2023</w:t>
-      </w:r>
-    </w:p>
-    <w:p>
-      <w:pPr>
-        <w:pStyle w:val="BodyText"/>
-      </w:pPr>
-      <w:r>
-        <w:t xml:space="preserve">Conception et réalisation d’une application de gestion immobilière pour la diaspora kényane, avec une équipe de 6.</w:t>
-      </w:r>
-    </w:p>
-    <w:p>
-      <w:pPr>
-        <w:numPr>
-          <w:ilvl w:val="0"/>
-          <w:numId w:val="1004"/>
-        </w:numPr>
-        <w:pStyle w:val="Compact"/>
-      </w:pPr>
-      <w:r>
-        <w:t xml:space="preserve">Modélisation de la solution (front, middle, back) et implémentation du middle et du back.</w:t>
-      </w:r>
-    </w:p>
-    <w:p>
-      <w:pPr>
-        <w:numPr>
-          <w:ilvl w:val="0"/>
-          <w:numId w:val="1004"/>
-        </w:numPr>
-        <w:pStyle w:val="Compact"/>
-      </w:pPr>
-      <w:r>
-        <w:t xml:space="preserve">Base MongoDB et API REST (OpenAPI, architecture Controller / Service / Repository).</w:t>
-      </w:r>
-    </w:p>
-    <w:p>
-      <w:pPr>
-        <w:numPr>
-          <w:ilvl w:val="0"/>
-          <w:numId w:val="1004"/>
-        </w:numPr>
-        <w:pStyle w:val="Compact"/>
-      </w:pPr>
-      <w:r>
-        <w:t xml:space="preserve">Application React pour le middle-office, site vitrine</w:t>
-      </w:r>
-      <w:r>
-        <w:t xml:space="preserve"> </w:t>
-      </w:r>
-      <w:hyperlink r:id="rId29">
-        <w:r>
-          <w:rPr>
-            <w:rStyle w:val="Hyperlink"/>
-          </w:rPr>
-          <w:t xml:space="preserve">hektare-immo.com</w:t>
-        </w:r>
-      </w:hyperlink>
-      <w:r>
-        <w:t xml:space="preserve"> </w:t>
-      </w:r>
-      <w:r>
-        <w:t xml:space="preserve">(HTML5, CSS3, jQuery).</w:t>
-      </w:r>
-    </w:p>
-    <w:p>
-      <w:pPr>
-        <w:numPr>
-          <w:ilvl w:val="0"/>
-          <w:numId w:val="1004"/>
-        </w:numPr>
-        <w:pStyle w:val="Compact"/>
-      </w:pPr>
-      <w:r>
-        <w:t xml:space="preserve">Pilotage Scrum / Kanban de l’équipe.</w:t>
-      </w:r>
-    </w:p>
-    <w:p>
-      <w:pPr>
-        <w:pStyle w:val="FirstParagraph"/>
-      </w:pPr>
-      <w:r>
-        <w:rPr>
-          <w:iCs/>
-          <w:i/>
-        </w:rPr>
-        <w:t xml:space="preserve">Stack : React, Node.js, Express, MongoDB, API REST, Git, GitHub</w:t>
-      </w:r>
-    </w:p>
-    <w:bookmarkEnd w:id="34"/>
-    <w:bookmarkStart w:id="35" w:name="X5a9ef16e59be0ea9289efff74cbad45d36d77bb"/>
-    <w:p>
-      <w:pPr>
-        <w:pStyle w:val="Heading3"/>
-      </w:pPr>
-      <w:r>
-        <w:t xml:space="preserve">Binas Group, Bruxelles — Chef de projet technique</w:t>
-      </w:r>
-    </w:p>
-    <w:p>
-      <w:pPr>
-        <w:pStyle w:val="FirstParagraph"/>
-      </w:pPr>
-      <w:r>
-        <w:rPr>
-          <w:bCs/>
-          <w:b/>
-        </w:rPr>
-        <w:t xml:space="preserve">11/2020 – 01/2021</w:t>
-      </w:r>
-    </w:p>
-    <w:p>
-      <w:pPr>
-        <w:pStyle w:val="BodyText"/>
-      </w:pPr>
-      <w:r>
-        <w:t xml:space="preserve">Développement ex nihilo d’un PDM de gestion de contacts, avec une équipe de 3.</w:t>
-      </w:r>
-    </w:p>
-    <w:p>
-      <w:pPr>
-        <w:numPr>
-          <w:ilvl w:val="0"/>
-          <w:numId w:val="1005"/>
-        </w:numPr>
-        <w:pStyle w:val="Compact"/>
-      </w:pPr>
-      <w:r>
-        <w:t xml:space="preserve">Architecture de la solution, base SQL Server et ORM Dapper.</w:t>
-      </w:r>
-    </w:p>
-    <w:p>
-      <w:pPr>
-        <w:numPr>
-          <w:ilvl w:val="0"/>
-          <w:numId w:val="1005"/>
-        </w:numPr>
-        <w:pStyle w:val="Compact"/>
-      </w:pPr>
-      <w:r>
-        <w:t xml:space="preserve">API .NET Core hébergée sur Azure, client WPF (Caliburn Micro).</w:t>
-      </w:r>
-    </w:p>
-    <w:bookmarkEnd w:id="35"/>
-    <w:bookmarkStart w:id="36" w:name="X1484c8a497e2df52127ffae1443cf8e91874a3d"/>
-    <w:p>
-      <w:pPr>
-        <w:pStyle w:val="Heading3"/>
-      </w:pPr>
-      <w:r>
-        <w:t xml:space="preserve">Sinequanone Institute, Bezons — Formateur Master 1 et 2</w:t>
-      </w:r>
-    </w:p>
-    <w:p>
-      <w:pPr>
-        <w:pStyle w:val="FirstParagraph"/>
-      </w:pPr>
-      <w:r>
-        <w:rPr>
-          <w:bCs/>
-          <w:b/>
-        </w:rPr>
-        <w:t xml:space="preserve">Depuis 08/2020</w:t>
-      </w:r>
-    </w:p>
-    <w:p>
-      <w:pPr>
-        <w:pStyle w:val="BodyText"/>
-      </w:pPr>
-      <w:r>
-        <w:t xml:space="preserve">Formation d’alternants au développement full-stack, au Software Craft, au DevOps (CI/CD) et à la gestion de projet agile. Deux plateformes réalisées : facturation (MongoDB, Node.js, React, Stripe, Docker) et contrats d’apprentis (Vue.js, Sequelize).</w:t>
-      </w:r>
-    </w:p>
-    <w:bookmarkEnd w:id="36"/>
-    <w:bookmarkStart w:id="37" w:name="betclic-group-bordeaux-tech-lead"/>
-    <w:p>
-      <w:pPr>
-        <w:pStyle w:val="Heading3"/>
-      </w:pPr>
-      <w:r>
-        <w:t xml:space="preserve">Betclic Group, Bordeaux — Tech Lead</w:t>
-      </w:r>
-    </w:p>
-    <w:p>
-      <w:pPr>
-        <w:pStyle w:val="FirstParagraph"/>
-      </w:pPr>
-      <w:r>
-        <w:rPr>
-          <w:bCs/>
-          <w:b/>
-        </w:rPr>
-        <w:t xml:space="preserve">11/2019 – 10/2020</w:t>
-      </w:r>
-    </w:p>
-    <w:p>
-      <w:pPr>
-        <w:pStyle w:val="BodyText"/>
-      </w:pPr>
-      <w:r>
-        <w:t xml:space="preserve">Tech Lead d’un groupe de 4 dans une équipe de 20, sur la refonte de services Windows et d’API REST.</w:t>
-      </w:r>
-    </w:p>
-    <w:p>
-      <w:pPr>
-        <w:numPr>
-          <w:ilvl w:val="0"/>
-          <w:numId w:val="1006"/>
-        </w:numPr>
-        <w:pStyle w:val="Compact"/>
-      </w:pPr>
-      <w:r>
-        <w:t xml:space="preserve">API recevant en temps réel les messages des brokers sur les matchs (RabbitMQ).</w:t>
-      </w:r>
-    </w:p>
-    <w:p>
-      <w:pPr>
-        <w:numPr>
-          <w:ilvl w:val="0"/>
-          <w:numId w:val="1006"/>
-        </w:numPr>
-        <w:pStyle w:val="Compact"/>
-      </w:pPr>
-      <w:r>
-        <w:t xml:space="preserve">Procédures stockées, ORM Dapper, monitoring Datadog et Kibana.</w:t>
-      </w:r>
-    </w:p>
-    <w:p>
-      <w:pPr>
-        <w:numPr>
-          <w:ilvl w:val="0"/>
-          <w:numId w:val="1006"/>
-        </w:numPr>
-        <w:pStyle w:val="Compact"/>
-      </w:pPr>
-      <w:r>
-        <w:t xml:space="preserve">Revues de code, mises en production (TeamCity, Jenkins, Octopus).</w:t>
-      </w:r>
-    </w:p>
-    <w:bookmarkEnd w:id="37"/>
-    <w:bookmarkStart w:id="38" w:name="X0cdf2bb6935fa00dd9b8b631fdc955f44032d5e"/>
-    <w:p>
-      <w:pPr>
-        <w:pStyle w:val="Heading3"/>
-      </w:pPr>
-      <w:r>
-        <w:t xml:space="preserve">Société Générale CIB, La Défense — Lead Developer</w:t>
-      </w:r>
-    </w:p>
-    <w:p>
-      <w:pPr>
-        <w:pStyle w:val="FirstParagraph"/>
-      </w:pPr>
-      <w:r>
-        <w:rPr>
-          <w:bCs/>
-          <w:b/>
-        </w:rPr>
-        <w:t xml:space="preserve">01/2019 – 09/2019</w:t>
-      </w:r>
-    </w:p>
-    <w:p>
-      <w:pPr>
-        <w:pStyle w:val="BodyText"/>
-      </w:pPr>
-      <w:r>
-        <w:t xml:space="preserve">Maintenance de XOne (Forex Cash) : refonte des tests unitaires (NUnit, Moq), procédures PL/SQL sur Oracle.</w:t>
-      </w:r>
-    </w:p>
-    <w:bookmarkEnd w:id="38"/>
-    <w:bookmarkStart w:id="39" w:name="ag-insurance-bruxelles-lead-developer"/>
-    <w:p>
-      <w:pPr>
-        <w:pStyle w:val="Heading3"/>
-      </w:pPr>
-      <w:r>
-        <w:t xml:space="preserve">AG Insurance, Bruxelles — Lead Developer</w:t>
-      </w:r>
-    </w:p>
-    <w:p>
-      <w:pPr>
-        <w:pStyle w:val="FirstParagraph"/>
-      </w:pPr>
-      <w:r>
-        <w:rPr>
-          <w:bCs/>
-          <w:b/>
-        </w:rPr>
-        <w:t xml:space="preserve">08/2017 – 08/2018</w:t>
-      </w:r>
-    </w:p>
-    <w:p>
-      <w:pPr>
-        <w:pStyle w:val="BodyText"/>
-      </w:pPr>
-      <w:r>
-        <w:t xml:space="preserve">Évolution d’une application web qui pilote les calculs d’une grille AFM et remplace un outil Excel. Back-end WCF, écrans ASP.NET MVC.</w:t>
-      </w:r>
-    </w:p>
-    <w:bookmarkEnd w:id="39"/>
-    <w:bookmarkStart w:id="40" w:name="X6e959d482d99b4b04040d4878ab680f6eaf8fe7"/>
-    <w:p>
-      <w:pPr>
-        <w:pStyle w:val="Heading3"/>
-      </w:pPr>
-      <w:r>
-        <w:t xml:space="preserve">Candriam Investors Group, Paris — Lead Developer / Architecte</w:t>
-      </w:r>
-    </w:p>
-    <w:p>
-      <w:pPr>
-        <w:pStyle w:val="FirstParagraph"/>
-      </w:pPr>
-      <w:r>
-        <w:rPr>
-          <w:bCs/>
-          <w:b/>
-        </w:rPr>
-        <w:t xml:space="preserve">11/2016 – 03/2017</w:t>
-      </w:r>
-    </w:p>
-    <w:p>
-      <w:pPr>
-        <w:pStyle w:val="BodyText"/>
-      </w:pPr>
-      <w:r>
-        <w:t xml:space="preserve">Migration de batchs VB et VB.NET vers C# .NET 4 : inventaire des applications, étude des dépendances, KPI, développement en TDD.</w:t>
-      </w:r>
-    </w:p>
-    <w:bookmarkEnd w:id="40"/>
-    <w:bookmarkStart w:id="41" w:name="X6990560913d7d143c03c310b2e29a4877869ccb"/>
-    <w:p>
-      <w:pPr>
-        <w:pStyle w:val="Heading3"/>
-      </w:pPr>
-      <w:r>
-        <w:t xml:space="preserve">CEGC (Groupe BPCE), La Défense — Lead Developer</w:t>
-      </w:r>
-    </w:p>
-    <w:p>
-      <w:pPr>
-        <w:pStyle w:val="FirstParagraph"/>
-      </w:pPr>
-      <w:r>
-        <w:rPr>
-          <w:bCs/>
-          <w:b/>
-        </w:rPr>
-        <w:t xml:space="preserve">10/2014 – 10/2016</w:t>
-      </w:r>
-    </w:p>
-    <w:p>
-      <w:pPr>
-        <w:pStyle w:val="BodyText"/>
-      </w:pPr>
-      <w:r>
-        <w:t xml:space="preserve">Évolutions de l’application de gestion des garanties et cautionnements (ASP.NET, WinForms, WCF, SSRS) : spécifications techniques, architecture, packaging et recette. Audit de performance pour BPCE en 07/2014.</w:t>
-      </w:r>
-    </w:p>
-    <w:bookmarkEnd w:id="41"/>
-    <w:bookmarkStart w:id="42" w:name="missions-antérieures-2006-2014"/>
-    <w:p>
-      <w:pPr>
-        <w:pStyle w:val="Heading3"/>
-      </w:pPr>
-      <w:r>
-        <w:t xml:space="preserve">Missions antérieures (2006 – 2014)</w:t>
-      </w:r>
-    </w:p>
-    <w:p>
-      <w:pPr>
-        <w:numPr>
-          <w:ilvl w:val="0"/>
-          <w:numId w:val="1007"/>
-        </w:numPr>
-        <w:pStyle w:val="Compact"/>
-      </w:pPr>
-      <w:r>
-        <w:rPr>
-          <w:bCs/>
-          <w:b/>
-        </w:rPr>
-        <w:t xml:space="preserve">Banque de France</w:t>
-      </w:r>
-      <w:r>
-        <w:t xml:space="preserve"> </w:t>
-      </w:r>
-      <w:r>
-        <w:t xml:space="preserve">(2013 – 2014) : Lead Developer VSTO sur Solvabilité II, ASP.NET MVC et SSIS.</w:t>
-      </w:r>
-    </w:p>
-    <w:p>
-      <w:pPr>
-        <w:numPr>
-          <w:ilvl w:val="0"/>
-          <w:numId w:val="1007"/>
-        </w:numPr>
-        <w:pStyle w:val="Compact"/>
-      </w:pPr>
-      <w:r>
-        <w:rPr>
-          <w:bCs/>
-          <w:b/>
-        </w:rPr>
-        <w:t xml:space="preserve">Crédit Agricole CIB</w:t>
-      </w:r>
-      <w:r>
-        <w:t xml:space="preserve"> </w:t>
-      </w:r>
-      <w:r>
-        <w:t xml:space="preserve">(2011 – 2012) : reporting du risque de contrepartie (VaR, PnL, stress), SSIS et SSAS.</w:t>
-      </w:r>
-    </w:p>
-    <w:p>
-      <w:pPr>
-        <w:numPr>
-          <w:ilvl w:val="0"/>
-          <w:numId w:val="1007"/>
-        </w:numPr>
-        <w:pStyle w:val="Compact"/>
-      </w:pPr>
-      <w:r>
-        <w:rPr>
-          <w:bCs/>
-          <w:b/>
-        </w:rPr>
-        <w:t xml:space="preserve">Société Générale CIB</w:t>
-      </w:r>
-      <w:r>
-        <w:t xml:space="preserve"> </w:t>
-      </w:r>
-      <w:r>
-        <w:t xml:space="preserve">(2010 – 2011) : connectivité marchés (Tradeweb, Bloomberg) sur les obligations d’État US, projet pilote Scrum.</w:t>
-      </w:r>
-    </w:p>
-    <w:p>
-      <w:pPr>
-        <w:numPr>
-          <w:ilvl w:val="0"/>
-          <w:numId w:val="1007"/>
-        </w:numPr>
-        <w:pStyle w:val="Compact"/>
-      </w:pPr>
-      <w:r>
-        <w:rPr>
-          <w:bCs/>
-          <w:b/>
-        </w:rPr>
-        <w:t xml:space="preserve">Natixis</w:t>
-      </w:r>
-      <w:r>
-        <w:t xml:space="preserve"> </w:t>
-      </w:r>
-      <w:r>
-        <w:t xml:space="preserve">(2009 – 2010) : applications de négociation de produits financiers.</w:t>
-      </w:r>
-    </w:p>
-    <w:p>
-      <w:pPr>
-        <w:numPr>
-          <w:ilvl w:val="0"/>
-          <w:numId w:val="1007"/>
-        </w:numPr>
-        <w:pStyle w:val="Compact"/>
-      </w:pPr>
-      <w:r>
-        <w:rPr>
-          <w:bCs/>
-          <w:b/>
-        </w:rPr>
-        <w:t xml:space="preserve">Itron, Newedge, C-Design Fashion</w:t>
-      </w:r>
-      <w:r>
-        <w:t xml:space="preserve"> </w:t>
-      </w:r>
-      <w:r>
-        <w:t xml:space="preserve">(2006 – 2009) : logiciels industriels, administration de bases de données, PDM.</w:t>
-      </w:r>
-    </w:p>
-    <w:bookmarkEnd w:id="42"/>
     <w:bookmarkEnd w:id="43"/>
     <w:bookmarkStart w:id="44" w:name="formation-et-langues"/>
     <w:p>
@@ -1631,7 +1761,7 @@
       <w:pPr>
         <w:numPr>
           <w:ilvl w:val="0"/>
-          <w:numId w:val="1008"/>
+          <w:numId w:val="1009"/>
         </w:numPr>
         <w:pStyle w:val="Compact"/>
       </w:pPr>
@@ -1653,7 +1783,7 @@
       <w:pPr>
         <w:numPr>
           <w:ilvl w:val="0"/>
-          <w:numId w:val="1008"/>
+          <w:numId w:val="1009"/>
         </w:numPr>
         <w:pStyle w:val="Compact"/>
       </w:pPr>
@@ -1675,7 +1805,7 @@
       <w:pPr>
         <w:numPr>
           <w:ilvl w:val="0"/>
-          <w:numId w:val="1008"/>
+          <w:numId w:val="1009"/>
         </w:numPr>
         <w:pStyle w:val="Compact"/>
       </w:pPr>
@@ -1920,6 +2050,9 @@
     <w:abstractNumId w:val="991"/>
   </w:num>
   <w:num w:numId="1008">
+    <w:abstractNumId w:val="991"/>
+  </w:num>
+  <w:num w:numId="1009">
     <w:abstractNumId w:val="991"/>
   </w:num>
 </w:numbering>

</xml_diff>

<commit_message>
Sogecap : rôle d'Application Officer (et non Application Owner)
Le programme 2026 a été piloté en tant qu'Application Officer. Site et CV FR/EN.

Co-Authored-By: Claude Opus 5.5 <noreply@anthropic.com>
Claude-Session: https://claude.ai/code/session_01AXVNFt21u7UcfptizFrBPr
</commit_message>
<xml_diff>
--- a/resources/docs/biahprofile.docx
+++ b/resources/docs/biahprofile.docx
@@ -389,13 +389,13 @@
         <w:t xml:space="preserve">Expériences</w:t>
       </w:r>
     </w:p>
-    <w:bookmarkStart w:id="25" w:name="X6d0f917f60ac00492536af6a829068bcd2715b1"/>
+    <w:bookmarkStart w:id="25" w:name="Xf61fc308134d86a4d6dbbbb1ac05fc0050f8528"/>
     <w:p>
       <w:pPr>
         <w:pStyle w:val="Heading3"/>
       </w:pPr>
       <w:r>
-        <w:t xml:space="preserve">Sogecap (Société Générale Assurances), Paris — Chef de projet technique / Tech Lead (salarié)</w:t>
+        <w:t xml:space="preserve">Sogecap (Société Générale Assurances), Paris — Application Officer, chef de projet technique / Tech Lead (salarié)</w:t>
       </w:r>
     </w:p>
     <w:p>
@@ -427,7 +427,7 @@
           <w:bCs/>
           <w:b/>
         </w:rPr>
-        <w:t xml:space="preserve">Migration de la plateforme de calcul (2026) — POC validé, développement en voie d’achèvement</w:t>
+        <w:t xml:space="preserve">Migration de la plateforme de calcul (2026), pilotée en tant qu’Application Officer — POC validé, développement en voie d’achèvement</w:t>
       </w:r>
     </w:p>
     <w:p>

</xml_diff>

<commit_message>
Sogecap : rôles exacts (supervision React, développement dans le POC) ; Fluxo sans Redis/Celery
- Refonte React : supervision des développements, pas de développement direct.
- POC 2026 : back-end .NET 8 / Dapper, front-end HTML/CSS/JS (temps réel,
  cache IndexedDB), POC exploratoire Node.js / Sequelize en amont.
- Suppression du bloc « En tant que développeur » erroné.
- Fluxo : Redis et Celery retirés (supprimés du projet).
- CV FR et EN régénérés, version de cache 20261019c.

Co-Authored-By: Claude Opus 5.5 <noreply@anthropic.com>
Claude-Session: https://claude.ai/code/session_01AXVNFt21u7UcfptizFrBPr
</commit_message>
<xml_diff>
--- a/resources/docs/biahprofile.docx
+++ b/resources/docs/biahprofile.docx
@@ -464,7 +464,7 @@
         <w:pStyle w:val="Compact"/>
       </w:pPr>
       <w:r>
-        <w:t xml:space="preserve">Développé l’orchestration des calculs : API REST, dépendances entre jobs en graphe (DAG), machine à états, détection des plantages, répartition concurrente sûre sur PostgreSQL (</w:t>
+        <w:t xml:space="preserve">Développé le back-end du POC en .NET 8 / Dapper : API REST, dépendances entre jobs en graphe (DAG), machine à états, détection des plantages, répartition concurrente sûre sur PostgreSQL (</w:t>
       </w:r>
       <w:r>
         <w:rPr>
@@ -473,7 +473,7 @@
         <w:t xml:space="preserve">SKIP LOCKED</w:t>
       </w:r>
       <w:r>
-        <w:t xml:space="preserve">), en s’intégrant au modèle de données existant (Dapper).</w:t>
+        <w:t xml:space="preserve">), en s’intégrant au modèle de données existant.</w:t>
       </w:r>
     </w:p>
     <w:p>
@@ -485,7 +485,7 @@
         <w:pStyle w:val="Compact"/>
       </w:pPr>
       <w:r>
-        <w:t xml:space="preserve">Appliqué le moindre privilège (agents de calcul sans accès à la base) et documenté l’architecture cible.</w:t>
+        <w:t xml:space="preserve">Appliqué le moindre privilège (agents sans accès à la base) et documenté l’architecture cible ; squelettes de code générés avec Claude Code à partir de spécifications itératives.</w:t>
       </w:r>
     </w:p>
     <w:p>
@@ -497,7 +497,7 @@
         <w:pStyle w:val="Compact"/>
       </w:pPr>
       <w:r>
-        <w:t xml:space="preserve">Spécifié l’interface de soumission des calculs sur un design system commun à deux applications.</w:t>
+        <w:t xml:space="preserve">Développé le front-end du POC (HTML, CSS, JavaScript) : interface de soumission, supervision en temps réel de l’avancement des calculs et des logs, cache IndexedDB et optimisations côté client, sur un design system commun à deux applications.</w:t>
       </w:r>
     </w:p>
     <w:p>
@@ -509,6 +509,18 @@
         <w:pStyle w:val="Compact"/>
       </w:pPr>
       <w:r>
+        <w:t xml:space="preserve">En amont, POC exploratoire en Node.js / Sequelize, devenu l’application sœur dont le design system a été repris.</w:t>
+      </w:r>
+    </w:p>
+    <w:p>
+      <w:pPr>
+        <w:numPr>
+          <w:ilvl w:val="0"/>
+          <w:numId w:val="1001"/>
+        </w:numPr>
+        <w:pStyle w:val="Compact"/>
+      </w:pPr>
+      <w:r>
         <w:t xml:space="preserve">Mis en place le pilotage agile : backlog Epic → Feature → User Story, sprints suivis par milestones GitLab, modèle de ticket Jira standardisé (contexte, livrables, critères d’acceptation) ; piloté le chantier de migration web (plan projet, démos, recettes, livraisons).</w:t>
       </w:r>
     </w:p>
@@ -534,18 +546,6 @@
       </w:pPr>
       <w:r>
         <w:t xml:space="preserve">En cours : CI/CD GitLab pour une équipe .NET non couverte par la plateforme DevOps du Groupe (Java uniquement). Revue des scripts de build : suppression d’un secret en dur et des faux succès de publication.</w:t>
-      </w:r>
-    </w:p>
-    <w:p>
-      <w:pPr>
-        <w:numPr>
-          <w:ilvl w:val="0"/>
-          <w:numId w:val="1001"/>
-        </w:numPr>
-        <w:pStyle w:val="Compact"/>
-      </w:pPr>
-      <w:r>
-        <w:t xml:space="preserve">Spécifications itératives avec Claude Code pour générer les squelettes de code et l’interface.</w:t>
       </w:r>
     </w:p>
     <w:p>
@@ -569,7 +569,7 @@
         <w:pStyle w:val="Compact"/>
       </w:pPr>
       <w:r>
-        <w:t xml:space="preserve">Refonte de l’application WPF en application web React, et maintenance de la version WPF.</w:t>
+        <w:t xml:space="preserve">Supervision de la refonte de l’application WPF en application web React (formulaires, tableaux, dashboards) : découpage, revues de code, mentoring ; maintenance de la version WPF.</w:t>
       </w:r>
     </w:p>
     <w:p>
@@ -582,18 +582,6 @@
       </w:pPr>
       <w:r>
         <w:t xml:space="preserve">Réarchitecture de la solution (GoF, SOLID, Software Craft) ; tests unitaires (NUnit, Moq) et couverture de code suivie dans SonarQube.</w:t>
-      </w:r>
-    </w:p>
-    <w:p>
-      <w:pPr>
-        <w:numPr>
-          <w:ilvl w:val="0"/>
-          <w:numId w:val="1002"/>
-        </w:numPr>
-        <w:pStyle w:val="Compact"/>
-      </w:pPr>
-      <w:r>
-        <w:t xml:space="preserve">Refonte du monitoring pour suivre les jobs de calcul en temps réel.</w:t>
       </w:r>
     </w:p>
     <w:p>
@@ -617,7 +605,7 @@
           <w:iCs/>
           <w:i/>
         </w:rPr>
-        <w:t xml:space="preserve">Stack : C#, .NET 8, ASP.NET Core, Kestrel, services Windows, Dapper, PostgreSQL, React, Node.js, MVC, WPF, PowerShell, IIS, NuGet, Artifactory, GitLab, Jira, Jenkins, Ansible, Kubernetes, MS HPC, Claude Code</w:t>
+        <w:t xml:space="preserve">Stack : C#, .NET 8, ASP.NET Core, Kestrel, services Windows, Dapper, PostgreSQL, HTML/CSS/JS, IndexedDB, React, Node.js, Sequelize, MVC, WPF, PowerShell, IIS, NuGet, Artifactory, GitLab, Jira, Jenkins, Ansible, Kubernetes, MS HPC, Claude Code</w:t>
       </w:r>
     </w:p>
     <w:bookmarkEnd w:id="25"/>
@@ -1307,7 +1295,7 @@
         <w:pStyle w:val="Compact"/>
       </w:pPr>
       <w:r>
-        <w:t xml:space="preserve">Stack : Next.js 14 (TypeScript, shadcn/ui, Recharts), FastAPI (Python), SQLAlchemy 2, PostgreSQL 16 (schéma dédié, vues, triggers), Redis / Celery, NextAuth, CI/CD GitHub Actions vers Railway et Vercel.</w:t>
+        <w:t xml:space="preserve">Stack : Next.js 14 (TypeScript, shadcn/ui, Recharts), FastAPI (Python), SQLAlchemy 2, PostgreSQL 16 (schéma dédié, vues, triggers), NextAuth, CI/CD GitHub Actions vers Railway et Vercel.</w:t>
       </w:r>
     </w:p>
     <w:p>
@@ -1838,7 +1826,7 @@
         <w:t xml:space="preserve"> </w:t>
       </w:r>
       <w:r>
-        <w:t xml:space="preserve">(chefs de projet et team leaders chez CEGC/BPCE, Banque de France, ACPR) disponibles sur demande.</w:t>
+        <w:t xml:space="preserve">disponibles sur demande (CEGC/BPCE, Banque de France, ACPR).</w:t>
       </w:r>
     </w:p>
     <w:bookmarkEnd w:id="44"/>

</xml_diff>

<commit_message>
CV et site : ajout de Bitojel (média de citations automatisé, IA éditoriale)
- CV FR/EN (PDF + DOCX) : bloc Bitojel dans la section IA générative, lien @bitojelx ;
  ligne Lissen de la section IA retirée (doublon de l'expérience), puces Fluxo fusionnées,
  marge verticale 9 mm pour rester sur 3 pages
- Site : expérience « Bitojel (projet personnel) » depuis 02/2026 et carte projet web
- Cache-busting v=20261023

Co-Authored-By: Claude <noreply@anthropic.com>
Claude-Session: https://claude.ai/code/session_01AXVNFt21u7UcfptizFrBPr
</commit_message>
<xml_diff>
--- a/resources/docs/biahprofile.docx
+++ b/resources/docs/biahprofile.docx
@@ -2,7 +2,7 @@
 <file path=word/document.xml><?xml version="1.0" encoding="utf-8"?>
 <w:document xmlns:w="http://schemas.openxmlformats.org/wordprocessingml/2006/main" xmlns:m="http://schemas.openxmlformats.org/officeDocument/2006/math" xmlns:r="http://schemas.openxmlformats.org/officeDocument/2006/relationships" xmlns:o="urn:schemas-microsoft-com:office:office" xmlns:v="urn:schemas-microsoft-com:vml" xmlns:w10="urn:schemas-microsoft-com:office:word" xmlns:a="http://schemas.openxmlformats.org/drawingml/2006/main" xmlns:pic="http://schemas.openxmlformats.org/drawingml/2006/picture" xmlns:wp="http://schemas.openxmlformats.org/drawingml/2006/wordprocessingDrawing">
   <w:body>
-    <w:bookmarkStart w:id="45" w:name="jean-luc-biah"/>
+    <w:bookmarkStart w:id="46" w:name="jean-luc-biah"/>
     <w:p>
       <w:pPr>
         <w:pStyle w:val="Heading1"/>
@@ -1209,7 +1209,7 @@
     </w:p>
     <w:bookmarkEnd w:id="36"/>
     <w:bookmarkEnd w:id="37"/>
-    <w:bookmarkStart w:id="38" w:name="ia-générative"/>
+    <w:bookmarkStart w:id="39" w:name="ia-générative"/>
     <w:p>
       <w:pPr>
         <w:pStyle w:val="Heading2"/>
@@ -1259,19 +1259,7 @@
         <w:pStyle w:val="Compact"/>
       </w:pPr>
       <w:r>
-        <w:t xml:space="preserve">Conseiller financier IA sur l’API Claude : réponses en streaming (SSE), prompt système alimenté automatiquement par le contexte financier (revenus, charges, reste à vivre, dettes, mois tendus).</w:t>
-      </w:r>
-    </w:p>
-    <w:p>
-      <w:pPr>
-        <w:numPr>
-          <w:ilvl w:val="0"/>
-          <w:numId w:val="1008"/>
-        </w:numPr>
-        <w:pStyle w:val="Compact"/>
-      </w:pPr>
-      <w:r>
-        <w:t xml:space="preserve">Prototype retiré après évaluation : la valeur apportée ne justifiait pas le coût d’API. Décision prise sur des critères produit, pas techniques.</w:t>
+        <w:t xml:space="preserve">Conseiller financier IA sur l’API Claude : réponses en streaming (SSE), prompt système alimenté automatiquement par le contexte financier (revenus, charges, reste à vivre, dettes, mois tendus). Prototype retiré après évaluation : la valeur apportée ne justifiait pas le coût d’API. Décision prise sur des critères produit, pas techniques.</w:t>
       </w:r>
     </w:p>
     <w:p>
@@ -1307,18 +1295,89 @@
           <w:bCs/>
           <w:b/>
         </w:rPr>
-        <w:t xml:space="preserve">Lissen (2025)</w:t>
+        <w:t xml:space="preserve">Bitojel — média de citations publié automatiquement (depuis 2026)</w:t>
       </w:r>
       <w:r>
         <w:t xml:space="preserve"> </w:t>
       </w:r>
       <w:r>
-        <w:t xml:space="preserve">— automatisations et assistance IA intégrées à la plateforme (API Anthropic, OpenAI).</w:t>
-      </w:r>
-    </w:p>
-    <w:p>
-      <w:pPr>
-        <w:pStyle w:val="BodyText"/>
+        <w:t xml:space="preserve">—</w:t>
+      </w:r>
+      <w:r>
+        <w:t xml:space="preserve"> </w:t>
+      </w:r>
+      <w:hyperlink r:id="rId38">
+        <w:r>
+          <w:rPr>
+            <w:rStyle w:val="Hyperlink"/>
+          </w:rPr>
+          <w:t xml:space="preserve">x.com/bitojelx</w:t>
+        </w:r>
+      </w:hyperlink>
+    </w:p>
+    <w:p>
+      <w:pPr>
+        <w:numPr>
+          <w:ilvl w:val="0"/>
+          <w:numId w:val="1009"/>
+        </w:numPr>
+        <w:pStyle w:val="Compact"/>
+      </w:pPr>
+      <w:r>
+        <w:t xml:space="preserve">Chaîne de publication automatisée : planification des citations, composition des visuels (portrait retouché et citation), publication quotidienne sur X ; Facebook prêt, vidéos courtes en conception. Tableau de bord web de pilotage (import, planning, auteurs, citations, suivi des publications).</w:t>
+      </w:r>
+    </w:p>
+    <w:p>
+      <w:pPr>
+        <w:numPr>
+          <w:ilvl w:val="0"/>
+          <w:numId w:val="1009"/>
+        </w:numPr>
+        <w:pStyle w:val="Compact"/>
+      </w:pPr>
+      <w:r>
+        <w:t xml:space="preserve">IA intégrée au travail éditorial : l’API Claude analyse les imports (doublons, auteurs inconnus, thématiques), enrichit le planning et rédige les métadonnées YouTube ; dans la fiche auteur, un assistant conversationnel exécute lui-même des actions (biographie, filigrane).</w:t>
+      </w:r>
+    </w:p>
+    <w:p>
+      <w:pPr>
+        <w:numPr>
+          <w:ilvl w:val="0"/>
+          <w:numId w:val="1009"/>
+        </w:numPr>
+        <w:pStyle w:val="Compact"/>
+      </w:pPr>
+      <w:r>
+        <w:t xml:space="preserve">API centrale réutilisée par mes applications : authentification JWT avec domaines autorisés, relais vers l’API Claude (clé côté serveur, limitation des appels). Développé avec Claude Code.</w:t>
+      </w:r>
+    </w:p>
+    <w:p>
+      <w:pPr>
+        <w:numPr>
+          <w:ilvl w:val="0"/>
+          <w:numId w:val="1009"/>
+        </w:numPr>
+        <w:pStyle w:val="Compact"/>
+      </w:pPr>
+      <w:r>
+        <w:t xml:space="preserve">Stack : Node.js / Express, Prisma, PostgreSQL, Sharp,</w:t>
+      </w:r>
+      <w:r>
+        <w:t xml:space="preserve"> </w:t>
+      </w:r>
+      <w:r>
+        <w:t xml:space="preserve">@napi-rs/canvas</w:t>
+      </w:r>
+      <w:r>
+        <w:t xml:space="preserve"> </w:t>
+      </w:r>
+      <w:r>
+        <w:t xml:space="preserve">; Netlify, Railway, Vercel (cron).</w:t>
+      </w:r>
+    </w:p>
+    <w:p>
+      <w:pPr>
+        <w:pStyle w:val="FirstParagraph"/>
       </w:pPr>
       <w:r>
         <w:rPr>
@@ -1334,8 +1393,8 @@
         <w:t xml:space="preserve">— Claude Code et GitHub Copilot au quotidien, cadrés par des règles projet (CLAUDE.md) : principes SOLID imposés, aucune exécution SQL sans validation.</w:t>
       </w:r>
     </w:p>
-    <w:bookmarkEnd w:id="38"/>
-    <w:bookmarkStart w:id="43" w:name="réalisations-via-cyrano-conseil"/>
+    <w:bookmarkEnd w:id="39"/>
+    <w:bookmarkStart w:id="44" w:name="réalisations-via-cyrano-conseil"/>
     <w:p>
       <w:pPr>
         <w:pStyle w:val="Heading2"/>
@@ -1413,7 +1472,7 @@
               <w:pStyle w:val="Compact"/>
               <w:jc w:val="left"/>
             </w:pPr>
-            <w:hyperlink r:id="rId39">
+            <w:hyperlink r:id="rId40">
               <w:r>
                 <w:rPr>
                   <w:rStyle w:val="Hyperlink"/>
@@ -1532,7 +1591,7 @@
               <w:pStyle w:val="Compact"/>
               <w:jc w:val="left"/>
             </w:pPr>
-            <w:hyperlink r:id="rId40">
+            <w:hyperlink r:id="rId41">
               <w:r>
                 <w:rPr>
                   <w:rStyle w:val="Hyperlink"/>
@@ -1575,7 +1634,7 @@
               <w:pStyle w:val="Compact"/>
               <w:jc w:val="left"/>
             </w:pPr>
-            <w:hyperlink r:id="rId41">
+            <w:hyperlink r:id="rId42">
               <w:r>
                 <w:rPr>
                   <w:rStyle w:val="Hyperlink"/>
@@ -1661,7 +1720,7 @@
               <w:pStyle w:val="Compact"/>
               <w:jc w:val="left"/>
             </w:pPr>
-            <w:hyperlink r:id="rId42">
+            <w:hyperlink r:id="rId43">
               <w:r>
                 <w:rPr>
                   <w:rStyle w:val="Hyperlink"/>
@@ -1717,7 +1776,7 @@
               <w:jc w:val="left"/>
             </w:pPr>
             <w:r>
-              <w:t xml:space="preserve">E-commerce</w:t>
+              <w:t xml:space="preserve">E‑commerce</w:t>
             </w:r>
           </w:p>
         </w:tc>
@@ -1735,8 +1794,8 @@
         </w:tc>
       </w:tr>
     </w:tbl>
-    <w:bookmarkEnd w:id="43"/>
-    <w:bookmarkStart w:id="44" w:name="formation-et-langues"/>
+    <w:bookmarkEnd w:id="44"/>
+    <w:bookmarkStart w:id="45" w:name="formation-et-langues"/>
     <w:p>
       <w:pPr>
         <w:pStyle w:val="Heading2"/>
@@ -1749,7 +1808,7 @@
       <w:pPr>
         <w:numPr>
           <w:ilvl w:val="0"/>
-          <w:numId w:val="1009"/>
+          <w:numId w:val="1010"/>
         </w:numPr>
         <w:pStyle w:val="Compact"/>
       </w:pPr>
@@ -1771,7 +1830,7 @@
       <w:pPr>
         <w:numPr>
           <w:ilvl w:val="0"/>
-          <w:numId w:val="1009"/>
+          <w:numId w:val="1010"/>
         </w:numPr>
         <w:pStyle w:val="Compact"/>
       </w:pPr>
@@ -1793,7 +1852,7 @@
       <w:pPr>
         <w:numPr>
           <w:ilvl w:val="0"/>
-          <w:numId w:val="1009"/>
+          <w:numId w:val="1010"/>
         </w:numPr>
         <w:pStyle w:val="Compact"/>
       </w:pPr>
@@ -1813,7 +1872,11 @@
     </w:p>
     <w:p>
       <w:pPr>
-        <w:pStyle w:val="FirstParagraph"/>
+        <w:numPr>
+          <w:ilvl w:val="0"/>
+          <w:numId w:val="1010"/>
+        </w:numPr>
+        <w:pStyle w:val="Compact"/>
       </w:pPr>
       <w:r>
         <w:rPr>
@@ -1826,11 +1889,11 @@
         <w:t xml:space="preserve"> </w:t>
       </w:r>
       <w:r>
-        <w:t xml:space="preserve">disponibles sur demande (CEGC/BPCE, Banque de France, ACPR).</w:t>
-      </w:r>
-    </w:p>
-    <w:bookmarkEnd w:id="44"/>
+        <w:t xml:space="preserve">— disponibles sur demande (CEGC/BPCE, Banque de France, ACPR)</w:t>
+      </w:r>
+    </w:p>
     <w:bookmarkEnd w:id="45"/>
+    <w:bookmarkEnd w:id="46"/>
     <w:sectPr/>
   </w:body>
 </w:document>
@@ -2041,6 +2104,9 @@
     <w:abstractNumId w:val="991"/>
   </w:num>
   <w:num w:numId="1009">
+    <w:abstractNumId w:val="991"/>
+  </w:num>
+  <w:num w:numId="1010">
     <w:abstractNumId w:val="991"/>
   </w:num>
 </w:numbering>

</xml_diff>

<commit_message>
CV et site : ajout de GRIM, Electron dans le service bureau, retrait de STYX
- CV FR/EN (PDF + DOCX) : GRIM dans la section IA générative (phrase d'intro retirée pour rester sur 3 pages)
- Site : carte projet GRIM (lien vers le dépôt public et ses installateurs), Electron ajouté au service « Développement Windows et librairies »
- Confidentialité : « STYX » retiré des mots-clés de la carte Groupe Société Générale
- Cache-busting v=20261024

Co-Authored-By: Claude <noreply@anthropic.com>
Claude-Session: https://claude.ai/code/session_01AXVNFt21u7UcfptizFrBPr
</commit_message>
<xml_diff>
--- a/resources/docs/biahprofile.docx
+++ b/resources/docs/biahprofile.docx
@@ -2,7 +2,7 @@
 <file path=word/document.xml><?xml version="1.0" encoding="utf-8"?>
 <w:document xmlns:w="http://schemas.openxmlformats.org/wordprocessingml/2006/main" xmlns:m="http://schemas.openxmlformats.org/officeDocument/2006/math" xmlns:r="http://schemas.openxmlformats.org/officeDocument/2006/relationships" xmlns:o="urn:schemas-microsoft-com:office:office" xmlns:v="urn:schemas-microsoft-com:vml" xmlns:w10="urn:schemas-microsoft-com:office:word" xmlns:a="http://schemas.openxmlformats.org/drawingml/2006/main" xmlns:pic="http://schemas.openxmlformats.org/drawingml/2006/picture" xmlns:wp="http://schemas.openxmlformats.org/drawingml/2006/wordprocessingDrawing">
   <w:body>
-    <w:bookmarkStart w:id="46" w:name="jean-luc-biah"/>
+    <w:bookmarkStart w:id="47" w:name="jean-luc-biah"/>
     <w:p>
       <w:pPr>
         <w:pStyle w:val="Heading1"/>
@@ -1209,7 +1209,7 @@
     </w:p>
     <w:bookmarkEnd w:id="36"/>
     <w:bookmarkEnd w:id="37"/>
-    <w:bookmarkStart w:id="39" w:name="ia-générative"/>
+    <w:bookmarkStart w:id="40" w:name="ia-générative"/>
     <w:p>
       <w:pPr>
         <w:pStyle w:val="Heading2"/>
@@ -1221,14 +1221,6 @@
     <w:p>
       <w:pPr>
         <w:pStyle w:val="FirstParagraph"/>
-      </w:pPr>
-      <w:r>
-        <w:t xml:space="preserve">J’intègre l’IA générative à deux niveaux : dans les produits que je construis, et dans ma façon de développer.</w:t>
-      </w:r>
-    </w:p>
-    <w:p>
-      <w:pPr>
-        <w:pStyle w:val="BodyText"/>
       </w:pPr>
       <w:r>
         <w:rPr>
@@ -1384,6 +1376,53 @@
           <w:bCs/>
           <w:b/>
         </w:rPr>
+        <w:t xml:space="preserve">GRIM (2026)</w:t>
+      </w:r>
+      <w:r>
+        <w:t xml:space="preserve"> </w:t>
+      </w:r>
+      <w:r>
+        <w:t xml:space="preserve">— application de bureau Electron (macOS, Windows) de suivi de mes projets menés avec l’IA : agrège les</w:t>
+      </w:r>
+      <w:r>
+        <w:t xml:space="preserve"> </w:t>
+      </w:r>
+      <w:r>
+        <w:rPr>
+          <w:rStyle w:val="VerbatimChar"/>
+        </w:rPr>
+        <w:t xml:space="preserve">summary.md</w:t>
+      </w:r>
+      <w:r>
+        <w:t xml:space="preserve"> </w:t>
+      </w:r>
+      <w:r>
+        <w:t xml:space="preserve">tenus à jour par l’agent dans chaque dépôt et rouvre le projet Claude en un clic. React, TypeScript, CI GitHub Actions —</w:t>
+      </w:r>
+      <w:r>
+        <w:t xml:space="preserve"> </w:t>
+      </w:r>
+      <w:hyperlink r:id="rId39">
+        <w:r>
+          <w:rPr>
+            <w:rStyle w:val="Hyperlink"/>
+          </w:rPr>
+          <w:t xml:space="preserve">github.com/jlbiahdev/grim</w:t>
+        </w:r>
+      </w:hyperlink>
+      <w:r>
+        <w:t xml:space="preserve">.</w:t>
+      </w:r>
+    </w:p>
+    <w:p>
+      <w:pPr>
+        <w:pStyle w:val="BodyText"/>
+      </w:pPr>
+      <w:r>
+        <w:rPr>
+          <w:bCs/>
+          <w:b/>
+        </w:rPr>
         <w:t xml:space="preserve">Développement assisté par agents</w:t>
       </w:r>
       <w:r>
@@ -1393,8 +1432,8 @@
         <w:t xml:space="preserve">— Claude Code et GitHub Copilot au quotidien, cadrés par des règles projet (CLAUDE.md) : principes SOLID imposés, aucune exécution SQL sans validation.</w:t>
       </w:r>
     </w:p>
-    <w:bookmarkEnd w:id="39"/>
-    <w:bookmarkStart w:id="44" w:name="réalisations-via-cyrano-conseil"/>
+    <w:bookmarkEnd w:id="40"/>
+    <w:bookmarkStart w:id="45" w:name="réalisations-via-cyrano-conseil"/>
     <w:p>
       <w:pPr>
         <w:pStyle w:val="Heading2"/>
@@ -1472,7 +1511,7 @@
               <w:pStyle w:val="Compact"/>
               <w:jc w:val="left"/>
             </w:pPr>
-            <w:hyperlink r:id="rId40">
+            <w:hyperlink r:id="rId41">
               <w:r>
                 <w:rPr>
                   <w:rStyle w:val="Hyperlink"/>
@@ -1591,7 +1630,7 @@
               <w:pStyle w:val="Compact"/>
               <w:jc w:val="left"/>
             </w:pPr>
-            <w:hyperlink r:id="rId41">
+            <w:hyperlink r:id="rId42">
               <w:r>
                 <w:rPr>
                   <w:rStyle w:val="Hyperlink"/>
@@ -1634,7 +1673,7 @@
               <w:pStyle w:val="Compact"/>
               <w:jc w:val="left"/>
             </w:pPr>
-            <w:hyperlink r:id="rId42">
+            <w:hyperlink r:id="rId43">
               <w:r>
                 <w:rPr>
                   <w:rStyle w:val="Hyperlink"/>
@@ -1720,7 +1759,7 @@
               <w:pStyle w:val="Compact"/>
               <w:jc w:val="left"/>
             </w:pPr>
-            <w:hyperlink r:id="rId43">
+            <w:hyperlink r:id="rId44">
               <w:r>
                 <w:rPr>
                   <w:rStyle w:val="Hyperlink"/>
@@ -1794,8 +1833,8 @@
         </w:tc>
       </w:tr>
     </w:tbl>
-    <w:bookmarkEnd w:id="44"/>
-    <w:bookmarkStart w:id="45" w:name="formation-et-langues"/>
+    <w:bookmarkEnd w:id="45"/>
+    <w:bookmarkStart w:id="46" w:name="formation-et-langues"/>
     <w:p>
       <w:pPr>
         <w:pStyle w:val="Heading2"/>
@@ -1892,8 +1931,8 @@
         <w:t xml:space="preserve">— disponibles sur demande (CEGC/BPCE, Banque de France, ACPR)</w:t>
       </w:r>
     </w:p>
-    <w:bookmarkEnd w:id="45"/>
     <w:bookmarkEnd w:id="46"/>
+    <w:bookmarkEnd w:id="47"/>
     <w:sectPr/>
   </w:body>
 </w:document>

</xml_diff>

<commit_message>
Lissen : descriptions corrigées (application d'accompagnement spirituel, Lissen Forge backend de contenus)
- Site : cartes Lissen et Lissen Forge, expérience Les Rappelés (Lissen Forge, LissenSrv, LissenCron)
- CV FR/EN (PDF + DOCX) : expérience Les Rappelés et tableau des réalisations ; toujours 3 pages

Co-Authored-By: Claude <noreply@anthropic.com>
Claude-Session: https://claude.ai/code/session_01AXVNFt21u7UcfptizFrBPr
</commit_message>
<xml_diff>
--- a/resources/docs/biahprofile.docx
+++ b/resources/docs/biahprofile.docx
@@ -647,7 +647,7 @@
         <w:pStyle w:val="Compact"/>
       </w:pPr>
       <w:r>
-        <w:t xml:space="preserve">Application mobile Expo / React Native publiée sur Google Play.</w:t>
+        <w:t xml:space="preserve">Application mobile d’accompagnement spirituel (Expo / React Native), publiée sur Google Play.</w:t>
       </w:r>
     </w:p>
     <w:p>
@@ -659,7 +659,7 @@
         <w:pStyle w:val="Compact"/>
       </w:pPr>
       <w:r>
-        <w:t xml:space="preserve">Site web Next.js / React déployé sur Vercel.</w:t>
+        <w:t xml:space="preserve">Lissen Forge, application backend de contenus : référentiel biblique, méditations, commentaires bibliques et blogs, qui alimente l’application.</w:t>
       </w:r>
     </w:p>
     <w:p>
@@ -671,7 +671,7 @@
         <w:pStyle w:val="Compact"/>
       </w:pPr>
       <w:r>
-        <w:t xml:space="preserve">Back-end « Forge » en Node.js / Express (API REST) sur Railway.</w:t>
+        <w:t xml:space="preserve">Services LissenSrv et LissenCron ; déploiement sur Vercel et Railway.</w:t>
       </w:r>
     </w:p>
     <w:p>
@@ -1541,7 +1541,7 @@
               <w:jc w:val="left"/>
             </w:pPr>
             <w:r>
-              <w:t xml:space="preserve">Application spirituelle Expo / React Native publiée sur Google Play, et Lissen Forge, back-office web de gestion des contenus et des utilisateurs</w:t>
+              <w:t xml:space="preserve">Application d’accompagnement spirituel (Expo / React Native) publiée sur Google Play, alimentée par son backend de contenus Lissen Forge</w:t>
             </w:r>
           </w:p>
         </w:tc>

</xml_diff>

<commit_message>
Lissen : descriptions réécrites d'après les dépôts (lissenapp, lissensrv, lissencron, lissenforge, lissenpage)
- Application Android Expo / React Native, notifications Firebase (FCM), LissenSrv (Node.js / Express, Railway),
  LissenCron (Vercel), Lissen Forge (API Express / Sequelize / PostgreSQL + administration React)
- Retrait de ce que le code ne montre pas : Next.js, appels API Anthropic / OpenAI, Sentry / Crashlytics
- Site (cartes, expérience, outils) et CV FR/EN (PDF + DOCX), toujours 3 pages

Co-Authored-By: Claude <noreply@anthropic.com>
Claude-Session: https://claude.ai/code/session_01AXVNFt21u7UcfptizFrBPr
</commit_message>
<xml_diff>
--- a/resources/docs/biahprofile.docx
+++ b/resources/docs/biahprofile.docx
@@ -635,7 +635,7 @@
         <w:pStyle w:val="BodyText"/>
       </w:pPr>
       <w:r>
-        <w:t xml:space="preserve">Conception et livraison de la plateforme Lissen, de l’application mobile au back-end.</w:t>
+        <w:t xml:space="preserve">Plateforme Lissen : application Android d’accompagnement spirituel et ses services.</w:t>
       </w:r>
     </w:p>
     <w:p>
@@ -647,7 +647,7 @@
         <w:pStyle w:val="Compact"/>
       </w:pPr>
       <w:r>
-        <w:t xml:space="preserve">Application mobile d’accompagnement spirituel (Expo / React Native), publiée sur Google Play.</w:t>
+        <w:t xml:space="preserve">Application mobile Expo / React Native publiée sur Google Play : verset biblique du jour, rappels de prière aux heures liturgiques, notifications push Firebase (FCM).</w:t>
       </w:r>
     </w:p>
     <w:p>
@@ -659,7 +659,7 @@
         <w:pStyle w:val="Compact"/>
       </w:pPr>
       <w:r>
-        <w:t xml:space="preserve">Lissen Forge, application backend de contenus : référentiel biblique, méditations, commentaires bibliques et blogs, qui alimente l’application.</w:t>
+        <w:t xml:space="preserve">LissenSrv, serveur Node.js / Express sur Railway : inscription des appareils, heures de prière, notifications à l’heure locale ; LissenCron (Vercel) le déclenche toutes les 30 min.</w:t>
       </w:r>
     </w:p>
     <w:p>
@@ -671,31 +671,7 @@
         <w:pStyle w:val="Compact"/>
       </w:pPr>
       <w:r>
-        <w:t xml:space="preserve">Services LissenSrv et LissenCron ; déploiement sur Vercel et Railway.</w:t>
-      </w:r>
-    </w:p>
-    <w:p>
-      <w:pPr>
-        <w:numPr>
-          <w:ilvl w:val="0"/>
-          <w:numId w:val="1003"/>
-        </w:numPr>
-        <w:pStyle w:val="Compact"/>
-      </w:pPr>
-      <w:r>
-        <w:t xml:space="preserve">CI/CD Vercel et Railway, suivi des crashs et des performances (Sentry, Crashlytics).</w:t>
-      </w:r>
-    </w:p>
-    <w:p>
-      <w:pPr>
-        <w:numPr>
-          <w:ilvl w:val="0"/>
-          <w:numId w:val="1003"/>
-        </w:numPr>
-        <w:pStyle w:val="Compact"/>
-      </w:pPr>
-      <w:r>
-        <w:t xml:space="preserve">Automatisations et assistance par IA (API Anthropic, OpenAI).</w:t>
+        <w:t xml:space="preserve">Lissen Forge, backend de contenus (référentiel biblique, méditations, commentaires, blogs) : API Node.js / Express, Sequelize, PostgreSQL, administration en React.</w:t>
       </w:r>
     </w:p>
     <w:p>
@@ -707,7 +683,7 @@
           <w:iCs/>
           <w:i/>
         </w:rPr>
-        <w:t xml:space="preserve">Stack : React Native, Expo, Next.js, Node.js, Express, PostgreSQL, IndexedDB, GitHub</w:t>
+        <w:t xml:space="preserve">Stack : React Native, Expo, Firebase, Node.js, Express, PostgreSQL, Railway, Vercel</w:t>
       </w:r>
     </w:p>
     <w:bookmarkEnd w:id="26"/>
@@ -1541,7 +1517,7 @@
               <w:jc w:val="left"/>
             </w:pPr>
             <w:r>
-              <w:t xml:space="preserve">Application d’accompagnement spirituel (Expo / React Native) publiée sur Google Play, alimentée par son backend de contenus Lissen Forge</w:t>
+              <w:t xml:space="preserve">Application Android d’accompagnement spirituel publiée sur Google Play, avec son serveur de notifications et son backend de contenus Lissen Forge</w:t>
             </w:r>
           </w:p>
         </w:tc>

</xml_diff>